<commit_message>
Add bounded evidence acquisition and auditable reconstruction prototypes
Co-Authored-By: Tatsuki Onishi <bougtoir@gmail.com>
</commit_message>
<xml_diff>
--- a/paper2_reconstruction/manuscript/Supplement_protocols_DRAFT_EN.docx
+++ b/paper2_reconstruction/manuscript/Supplement_protocols_DRAFT_EN.docx
@@ -3585,12 +3585,27 @@
     </w:p>
     <w:p>
       <w:r>
-        <w:t>The estimator and interval need dedicated implementation and validation before</w:t>
-      </w:r>
-    </w:p>
-    <w:p>
-      <w:r>
-        <w:t>protocol freeze; they are not part of the current preparation build.</w:t>
+        <w:t>The estimator and interval are implemented in `src/paper2/estimation.py`.</w:t>
+      </w:r>
+    </w:p>
+    <w:p>
+      <w:r>
+        <w:t>Exhaustive enumeration checks finite-population coverage for all sample sizes</w:t>
+      </w:r>
+    </w:p>
+    <w:p>
+      <w:r>
+        <w:t>and success totals in populations up to 12; boundary, census, unequal-weight,</w:t>
+      </w:r>
+    </w:p>
+    <w:p>
+      <w:r>
+        <w:t>unknown-outcome and denominator checks are also included. These software tests</w:t>
+      </w:r>
+    </w:p>
+    <w:p>
+      <w:r>
+        <w:t>are not empirical study estimates; protocol freeze remains pending.</w:t>
       </w:r>
     </w:p>
     <w:p>

</xml_diff>

<commit_message>
Screen deterministic pilot candidates from retained corpus evidence
Co-Authored-By: Tatsuki Onishi <bougtoir@gmail.com>
</commit_message>
<xml_diff>
--- a/paper2_reconstruction/manuscript/Supplement_protocols_DRAFT_EN.docx
+++ b/paper2_reconstruction/manuscript/Supplement_protocols_DRAFT_EN.docx
@@ -2296,6 +2296,51 @@
       </w:r>
     </w:p>
     <w:p>
+      <w:r>
+        <w:t>Article-text obtainability is recorded separately from G1–G5 as a prospective</w:t>
+      </w:r>
+    </w:p>
+    <w:p>
+      <w:r>
+        <w:t>access status: `lawful_text_retained` (identity-verified open PMC JATS, a</w:t>
+      </w:r>
+    </w:p>
+    <w:p>
+      <w:r>
+        <w:t>licensed publisher/repository copy, or an author-supplied copy), `no_lawful_public_text_located` (only closed locations found after the documented route checks) or</w:t>
+      </w:r>
+    </w:p>
+    <w:p>
+      <w:r>
+        <w:t>`route_check_incomplete`. A paper whose allowed material cannot be lawfully</w:t>
+      </w:r>
+    </w:p>
+    <w:p>
+      <w:r>
+        <w:t>retained before the pilot cannot be a pilot case and is recorded as prospectively</w:t>
+      </w:r>
+    </w:p>
+    <w:p>
+      <w:r>
+        <w:t>unavailable to the pilot with the routes checked; this is not a G3 input verdict,</w:t>
+      </w:r>
+    </w:p>
+    <w:p>
+      <w:r>
+        <w:t>not a G1 negative and does not remove the paper from the main frame. Machine</w:t>
+      </w:r>
+    </w:p>
+    <w:p>
+      <w:r>
+        <w:t>screening of retained text yields provisional G1/G2 proposals only; human</w:t>
+      </w:r>
+    </w:p>
+    <w:p>
+      <w:r>
+        <w:t>adjudication against the retained bytes is required before any gate is recorded.</w:t>
+      </w:r>
+    </w:p>
+    <w:p>
       <w:pPr>
         <w:pStyle w:val="Heading2"/>
       </w:pPr>

</xml_diff>

<commit_message>
Record delegated primary G1-G5 adjudication bound to retained bytes
Co-Authored-By: Tatsuki Onishi <bougtoir@gmail.com>
</commit_message>
<xml_diff>
--- a/paper2_reconstruction/manuscript/Supplement_protocols_DRAFT_EN.docx
+++ b/paper2_reconstruction/manuscript/Supplement_protocols_DRAFT_EN.docx
@@ -2341,6 +2341,46 @@
       </w:r>
     </w:p>
     <w:p>
+      <w:r>
+        <w:t>If the author delegates the first pass, the delegated gates are recorded as a</w:t>
+      </w:r>
+    </w:p>
+    <w:p>
+      <w:r>
+        <w:t>named primary-assessment record with a deviation entry, every gate citing segment</w:t>
+      </w:r>
+    </w:p>
+    <w:p>
+      <w:r>
+        <w:t>IDs of the hash-checked retained bytes, and remain provisional: the funnel stays</w:t>
+      </w:r>
+    </w:p>
+    <w:p>
+      <w:r>
+        <w:t>unassessed and no pilot selection is frozen until the author verifies or overturns</w:t>
+      </w:r>
+    </w:p>
+    <w:p>
+      <w:r>
+        <w:t>each gate. Delegated or author adjudication may skip a candidate only for absent</w:t>
+      </w:r>
+    </w:p>
+    <w:p>
+      <w:r>
+        <w:t>lawfully retained text or for G1/G2 ineligibility, never for G3, G4, G5 or</w:t>
+      </w:r>
+    </w:p>
+    <w:p>
+      <w:r>
+        <w:t>expected reconstruction difficulty, and every skipped candidate is retained with</w:t>
+      </w:r>
+    </w:p>
+    <w:p>
+      <w:r>
+        <w:t>its reason in the deterministic chain.</w:t>
+      </w:r>
+    </w:p>
+    <w:p>
       <w:pPr>
         <w:pStyle w:val="Heading2"/>
       </w:pPr>

</xml_diff>

<commit_message>
Qualify custodian, broker, telemetry, dependency-closure and freeze-before-reveal firewall controls
Co-Authored-By: Tatsuki Onishi <bougtoir@gmail.com>
</commit_message>
<xml_diff>
--- a/paper2_reconstruction/manuscript/Supplement_protocols_DRAFT_EN.docx
+++ b/paper2_reconstruction/manuscript/Supplement_protocols_DRAFT_EN.docx
@@ -1838,7 +1838,7 @@
     </w:p>
     <w:p>
       <w:r>
-        <w:t>DRAFT — FULL FIREWALL NOT QUALIFIED. Separate VMs alone are insufficient.</w:t>
+        <w:t>DRAFT — PARTIALLY QUALIFIED. Separate VMs alone are insufficient.</w:t>
       </w:r>
     </w:p>
     <w:p>
@@ -1848,7 +1848,42 @@
     </w:p>
     <w:p>
       <w:r>
-        <w:t>and API smoke qualifications only. Neither authorizes pilot or main runs.</w:t>
+        <w:t>and API smoke qualifications only. `paper2.firewall` qualifies the custodian,</w:t>
+      </w:r>
+    </w:p>
+    <w:p>
+      <w:r>
+        <w:t>broker, access telemetry, dependency closure, resource stop and</w:t>
+      </w:r>
+    </w:p>
+    <w:p>
+      <w:r>
+        <w:t>freeze-before-reveal controls on a retained pilot article with adversarial</w:t>
+      </w:r>
+    </w:p>
+    <w:p>
+      <w:r>
+        <w:t>negative cases (`results/firewall_qualification.json`, policy</w:t>
+      </w:r>
+    </w:p>
+    <w:p>
+      <w:r>
+        <w:t>`firewall-qualification-2026-09-24`). Still unqualified: model-side retrieval</w:t>
+      </w:r>
+    </w:p>
+    <w:p>
+      <w:r>
+        <w:t>tool restriction for provider-hosted tools, three-slot scheduling and budget</w:t>
+      </w:r>
+    </w:p>
+    <w:p>
+      <w:r>
+        <w:t>comparability, and independent human adjudicator governance. None of these</w:t>
+      </w:r>
+    </w:p>
+    <w:p>
+      <w:r>
+        <w:t>qualifications authorizes pilot or main runs.</w:t>
       </w:r>
     </w:p>
     <w:p>
@@ -2008,17 +2043,22 @@
     </w:p>
     <w:p>
       <w:r>
-        <w:t>must themselves have evidence and adversarial negative cases. The present</w:t>
-      </w:r>
-    </w:p>
-    <w:p>
-      <w:r>
-        <w:t>Devin preparation workflow does not implement these controls and must not be</w:t>
-      </w:r>
-    </w:p>
-    <w:p>
-      <w:r>
-        <w:t>relabelled a blinded reconstruction experiment.</w:t>
+        <w:t>must themselves have evidence and adversarial negative cases. The preparation</w:t>
+      </w:r>
+    </w:p>
+    <w:p>
+      <w:r>
+        <w:t>workflow that produced the protocols and candidate screening must not be</w:t>
+      </w:r>
+    </w:p>
+    <w:p>
+      <w:r>
+        <w:t>relabelled a blinded reconstruction experiment; the firewall qualification run</w:t>
+      </w:r>
+    </w:p>
+    <w:p>
+      <w:r>
+        <w:t>is a control test, not an outcome.</w:t>
       </w:r>
     </w:p>
     <w:p>

</xml_diff>

<commit_message>
Record second-pass gate verification, freeze deposited-data amendment, store ACCESSIBILITY_GATE_FAILED layer and select amended candidates
Co-Authored-By: Tatsuki Onishi <bougtoir@gmail.com>
</commit_message>
<xml_diff>
--- a/paper2_reconstruction/manuscript/Supplement_protocols_DRAFT_EN.docx
+++ b/paper2_reconstruction/manuscript/Supplement_protocols_DRAFT_EN.docx
@@ -753,6 +753,728 @@
     <w:p>
       <w:r>
         <w:t>before blind freeze, without inspecting original author code.</w:t>
+      </w:r>
+    </w:p>
+    <w:p>
+      <w:r>
+        <w:br w:type="page"/>
+      </w:r>
+    </w:p>
+    <w:p>
+      <w:pPr>
+        <w:pStyle w:val="Heading1"/>
+      </w:pPr>
+      <w:r>
+        <w:t>Protocol amendment AMEND-2026-09-24-03: deposited-data eligibility criterion</w:t>
+      </w:r>
+    </w:p>
+    <w:p>
+      <w:r>
+        <w:t>Status: author-instructed amendment, hash-frozen before any candidate is</w:t>
+      </w:r>
+    </w:p>
+    <w:p>
+      <w:r>
+        <w:t>screened under it. Applies to every candidate selected after the freeze.</w:t>
+      </w:r>
+    </w:p>
+    <w:p>
+      <w:pPr>
+        <w:pStyle w:val="Heading2"/>
+      </w:pPr>
+      <w:r>
+        <w:t>Basis</w:t>
+      </w:r>
+    </w:p>
+    <w:p>
+      <w:r>
+        <w:t>The provisional pilot (`DEV-2026-09-24-02`) reached no reconstruction attempt:</w:t>
+      </w:r>
+    </w:p>
+    <w:p>
+      <w:r>
+        <w:t>none of the seven provisional papers had study inputs that a third party could</w:t>
+      </w:r>
+    </w:p>
+    <w:p>
+      <w:r>
+        <w:t>obtain lawfully and immediately. On 2026-09-24 the author instructed that the</w:t>
+      </w:r>
+    </w:p>
+    <w:p>
+      <w:r>
+        <w:t>main analysis of publication-grounded reconstruction be restricted to papers</w:t>
+      </w:r>
+    </w:p>
+    <w:p>
+      <w:r>
+        <w:t>whose deposited analysis data are lawfully and immediately obtainable by a</w:t>
+      </w:r>
+    </w:p>
+    <w:p>
+      <w:r>
+        <w:t>third party, that every excluded paper be retained with its exclusion reason,</w:t>
+      </w:r>
+    </w:p>
+    <w:p>
+      <w:r>
+        <w:t>and that the seven provisional papers be moved to a separate accessibility</w:t>
+      </w:r>
+    </w:p>
+    <w:p>
+      <w:r>
+        <w:t>layer without any reconstruction success or failure rate.</w:t>
+      </w:r>
+    </w:p>
+    <w:p>
+      <w:pPr>
+        <w:pStyle w:val="Heading2"/>
+      </w:pPr>
+      <w:r>
+        <w:t>Amended eligibility (replaces the G3-as-outcome rule for the main sample)</w:t>
+      </w:r>
+    </w:p>
+    <w:p>
+      <w:r>
+        <w:t>A paper is eligible for the main reconstruction sample only if, in addition to</w:t>
+      </w:r>
+    </w:p>
+    <w:p>
+      <w:r>
+        <w:t>lawfully retained article text, primary G1 = yes and G2 != no, all of the</w:t>
+      </w:r>
+    </w:p>
+    <w:p>
+      <w:r>
+        <w:t>following hold at screening time and are recorded with retained evidence:</w:t>
+      </w:r>
+    </w:p>
+    <w:p>
+      <w:r>
+        <w:t>1. **Deposited analysis data are named in the article.** The article or its</w:t>
+      </w:r>
+    </w:p>
+    <w:p>
+      <w:r>
+        <w:t xml:space="preserve">   open supplement names a repository accession, persistent identifier or</w:t>
+      </w:r>
+    </w:p>
+    <w:p>
+      <w:r>
+        <w:t xml:space="preserve">   supplementary data file that holds the data consumed by the target</w:t>
+      </w:r>
+    </w:p>
+    <w:p>
+      <w:r>
+        <w:t xml:space="preserve">   computation (not only the outputs of that computation).</w:t>
+      </w:r>
+    </w:p>
+    <w:p>
+      <w:r>
+        <w:t>2. **Third-party lawful access is immediate.** The listing endpoint of the</w:t>
+      </w:r>
+    </w:p>
+    <w:p>
+      <w:r>
+        <w:t xml:space="preserve">   deposit answers an anonymous request with a machine-readable file list.</w:t>
+      </w:r>
+    </w:p>
+    <w:p>
+      <w:r>
+        <w:t xml:space="preserve">   No account approval, data-access committee, data-use agreement, author</w:t>
+      </w:r>
+    </w:p>
+    <w:p>
+      <w:r>
+        <w:t xml:space="preserve">   contact, institutional licence or payment may stand between a third party</w:t>
+      </w:r>
+    </w:p>
+    <w:p>
+      <w:r>
+        <w:t xml:space="preserve">   and the bytes. Free registration that is granted automatically is</w:t>
+      </w:r>
+    </w:p>
+    <w:p>
+      <w:r>
+        <w:t xml:space="preserve">   acceptable only if the file list itself is anonymous.</w:t>
+      </w:r>
+    </w:p>
+    <w:p>
+      <w:r>
+        <w:t>3. **The deposit is practically retrievable.** Every file needed for the</w:t>
+      </w:r>
+    </w:p>
+    <w:p>
+      <w:r>
+        <w:t xml:space="preserve">   target computation has an announced size, each file is at most</w:t>
+      </w:r>
+    </w:p>
+    <w:p>
+      <w:r>
+        <w:t xml:space="preserve">   `FILE_CAP = 2 GiB`, and the needed files total at most `TOTAL_CAP = 8 GiB`.</w:t>
+      </w:r>
+    </w:p>
+    <w:p>
+      <w:r>
+        <w:t xml:space="preserve">   Deposits that announce no sizes, or whose needed files exceed either cap,</w:t>
+      </w:r>
+    </w:p>
+    <w:p>
+      <w:r>
+        <w:t xml:space="preserve">   are excluded as practically unretrievable.</w:t>
+      </w:r>
+    </w:p>
+    <w:p>
+      <w:r>
+        <w:t>4. **The deposit is not outcome leakage.** Files that directly contain the</w:t>
+      </w:r>
+    </w:p>
+    <w:p>
+      <w:r>
+        <w:t xml:space="preserve">   target value (figure source tables, result tables) do not qualify as</w:t>
+      </w:r>
+    </w:p>
+    <w:p>
+      <w:r>
+        <w:t xml:space="preserve">   analysis data; they are withheld from every solver and held for</w:t>
+      </w:r>
+    </w:p>
+    <w:p>
+      <w:r>
+        <w:t xml:space="preserve">   post-reveal validation.</w:t>
+      </w:r>
+    </w:p>
+    <w:p>
+      <w:pPr>
+        <w:pStyle w:val="Heading2"/>
+      </w:pPr>
+      <w:r>
+        <w:t>Exclusion classes (retained, never silently dropped)</w:t>
+      </w:r>
+    </w:p>
+    <w:tbl>
+      <w:tblPr>
+        <w:tblStyle w:val="TableGrid"/>
+        <w:tblW w:type="auto" w:w="0"/>
+        <w:tblLook w:firstColumn="1" w:firstRow="1" w:lastColumn="0" w:lastRow="0" w:noHBand="0" w:noVBand="1" w:val="04A0"/>
+      </w:tblPr>
+      <w:tblGrid>
+        <w:gridCol w:w="5040"/>
+        <w:gridCol w:w="5040"/>
+      </w:tblGrid>
+      <w:tr>
+        <w:tc>
+          <w:tcPr>
+            <w:tcW w:type="dxa" w:w="5040"/>
+          </w:tcPr>
+          <w:p>
+            <w:pPr>
+              <w:keepNext/>
+            </w:pPr>
+            <w:r>
+              <w:rPr>
+                <w:sz w:val="18"/>
+              </w:rPr>
+              <w:t>class</w:t>
+            </w:r>
+          </w:p>
+        </w:tc>
+        <w:tc>
+          <w:tcPr>
+            <w:tcW w:type="dxa" w:w="5040"/>
+          </w:tcPr>
+          <w:p>
+            <w:pPr>
+              <w:keepNext/>
+            </w:pPr>
+            <w:r>
+              <w:rPr>
+                <w:sz w:val="18"/>
+              </w:rPr>
+              <w:t>meaning</w:t>
+            </w:r>
+          </w:p>
+        </w:tc>
+      </w:tr>
+      <w:tr>
+        <w:tc>
+          <w:tcPr>
+            <w:tcW w:type="dxa" w:w="5040"/>
+          </w:tcPr>
+          <w:p>
+            <w:pPr>
+              <w:keepNext/>
+            </w:pPr>
+            <w:r>
+              <w:rPr>
+                <w:sz w:val="18"/>
+              </w:rPr>
+              <w:t>`no lawful text retained`</w:t>
+            </w:r>
+          </w:p>
+        </w:tc>
+        <w:tc>
+          <w:tcPr>
+            <w:tcW w:type="dxa" w:w="5040"/>
+          </w:tcPr>
+          <w:p>
+            <w:pPr>
+              <w:keepNext/>
+            </w:pPr>
+            <w:r>
+              <w:rPr>
+                <w:sz w:val="18"/>
+              </w:rPr>
+              <w:t>article text not lawfully retained; unadjudicated, not negative</w:t>
+            </w:r>
+          </w:p>
+        </w:tc>
+      </w:tr>
+      <w:tr>
+        <w:tc>
+          <w:tcPr>
+            <w:tcW w:type="dxa" w:w="5040"/>
+          </w:tcPr>
+          <w:p>
+            <w:pPr>
+              <w:keepNext/>
+            </w:pPr>
+            <w:r>
+              <w:rPr>
+                <w:sz w:val="18"/>
+              </w:rPr>
+              <w:t>`no deposit named`</w:t>
+            </w:r>
+          </w:p>
+        </w:tc>
+        <w:tc>
+          <w:tcPr>
+            <w:tcW w:type="dxa" w:w="5040"/>
+          </w:tcPr>
+          <w:p>
+            <w:pPr>
+              <w:keepNext/>
+            </w:pPr>
+            <w:r>
+              <w:rPr>
+                <w:sz w:val="18"/>
+              </w:rPr>
+              <w:t>no accession, persistent identifier or data file detected in the retained text</w:t>
+            </w:r>
+          </w:p>
+        </w:tc>
+      </w:tr>
+      <w:tr>
+        <w:tc>
+          <w:tcPr>
+            <w:tcW w:type="dxa" w:w="5040"/>
+          </w:tcPr>
+          <w:p>
+            <w:pPr>
+              <w:keepNext/>
+            </w:pPr>
+            <w:r>
+              <w:rPr>
+                <w:sz w:val="18"/>
+              </w:rPr>
+              <w:t>`author request only`</w:t>
+            </w:r>
+          </w:p>
+        </w:tc>
+        <w:tc>
+          <w:tcPr>
+            <w:tcW w:type="dxa" w:w="5040"/>
+          </w:tcPr>
+          <w:p>
+            <w:pPr>
+              <w:keepNext/>
+            </w:pPr>
+            <w:r>
+              <w:rPr>
+                <w:sz w:val="18"/>
+              </w:rPr>
+              <w:t>data stated as available on request or from the corresponding author</w:t>
+            </w:r>
+          </w:p>
+        </w:tc>
+      </w:tr>
+      <w:tr>
+        <w:tc>
+          <w:tcPr>
+            <w:tcW w:type="dxa" w:w="5040"/>
+          </w:tcPr>
+          <w:p>
+            <w:pPr>
+              <w:keepNext/>
+            </w:pPr>
+            <w:r>
+              <w:rPr>
+                <w:sz w:val="18"/>
+              </w:rPr>
+              <w:t>`application required`</w:t>
+            </w:r>
+          </w:p>
+        </w:tc>
+        <w:tc>
+          <w:tcPr>
+            <w:tcW w:type="dxa" w:w="5040"/>
+          </w:tcPr>
+          <w:p>
+            <w:pPr>
+              <w:keepNext/>
+            </w:pPr>
+            <w:r>
+              <w:rPr>
+                <w:sz w:val="18"/>
+              </w:rPr>
+              <w:t>controlled-access repository or consortium (e.g. ADNI, dbGaP, EGA, UK Biobank)</w:t>
+            </w:r>
+          </w:p>
+        </w:tc>
+      </w:tr>
+      <w:tr>
+        <w:tc>
+          <w:tcPr>
+            <w:tcW w:type="dxa" w:w="5040"/>
+          </w:tcPr>
+          <w:p>
+            <w:pPr>
+              <w:keepNext/>
+            </w:pPr>
+            <w:r>
+              <w:rPr>
+                <w:sz w:val="18"/>
+              </w:rPr>
+              <w:t>`institutional licence`</w:t>
+            </w:r>
+          </w:p>
+        </w:tc>
+        <w:tc>
+          <w:tcPr>
+            <w:tcW w:type="dxa" w:w="5040"/>
+          </w:tcPr>
+          <w:p>
+            <w:pPr>
+              <w:keepNext/>
+            </w:pPr>
+            <w:r>
+              <w:rPr>
+                <w:sz w:val="18"/>
+              </w:rPr>
+              <w:t>access depends on an institutional contract or licence</w:t>
+            </w:r>
+          </w:p>
+        </w:tc>
+      </w:tr>
+      <w:tr>
+        <w:tc>
+          <w:tcPr>
+            <w:tcW w:type="dxa" w:w="5040"/>
+          </w:tcPr>
+          <w:p>
+            <w:pPr>
+              <w:keepNext/>
+            </w:pPr>
+            <w:r>
+              <w:rPr>
+                <w:sz w:val="18"/>
+              </w:rPr>
+              <w:t>`listing unavailable`</w:t>
+            </w:r>
+          </w:p>
+        </w:tc>
+        <w:tc>
+          <w:tcPr>
+            <w:tcW w:type="dxa" w:w="5040"/>
+          </w:tcPr>
+          <w:p>
+            <w:pPr>
+              <w:keepNext/>
+            </w:pPr>
+            <w:r>
+              <w:rPr>
+                <w:sz w:val="18"/>
+              </w:rPr>
+              <w:t>named route returned no anonymous machine-readable file list</w:t>
+            </w:r>
+          </w:p>
+        </w:tc>
+      </w:tr>
+      <w:tr>
+        <w:tc>
+          <w:tcPr>
+            <w:tcW w:type="dxa" w:w="5040"/>
+          </w:tcPr>
+          <w:p>
+            <w:pPr>
+              <w:keepNext/>
+            </w:pPr>
+            <w:r>
+              <w:rPr>
+                <w:sz w:val="18"/>
+              </w:rPr>
+              <w:t>`size unannounced`</w:t>
+            </w:r>
+          </w:p>
+        </w:tc>
+        <w:tc>
+          <w:tcPr>
+            <w:tcW w:type="dxa" w:w="5040"/>
+          </w:tcPr>
+          <w:p>
+            <w:pPr>
+              <w:keepNext/>
+            </w:pPr>
+            <w:r>
+              <w:rPr>
+                <w:sz w:val="18"/>
+              </w:rPr>
+              <w:t>route lists files without sizes</w:t>
+            </w:r>
+          </w:p>
+        </w:tc>
+      </w:tr>
+      <w:tr>
+        <w:tc>
+          <w:tcPr>
+            <w:tcW w:type="dxa" w:w="5040"/>
+          </w:tcPr>
+          <w:p>
+            <w:pPr>
+              <w:keepNext/>
+            </w:pPr>
+            <w:r>
+              <w:rPr>
+                <w:sz w:val="18"/>
+              </w:rPr>
+              <w:t>`above cap`</w:t>
+            </w:r>
+          </w:p>
+        </w:tc>
+        <w:tc>
+          <w:tcPr>
+            <w:tcW w:type="dxa" w:w="5040"/>
+          </w:tcPr>
+          <w:p>
+            <w:pPr>
+              <w:keepNext/>
+            </w:pPr>
+            <w:r>
+              <w:rPr>
+                <w:sz w:val="18"/>
+              </w:rPr>
+              <w:t>needed files exceed `FILE CAP` or `TOTAL CAP`</w:t>
+            </w:r>
+          </w:p>
+        </w:tc>
+      </w:tr>
+      <w:tr>
+        <w:tc>
+          <w:tcPr>
+            <w:tcW w:type="dxa" w:w="5040"/>
+          </w:tcPr>
+          <w:p>
+            <w:pPr>
+              <w:keepNext/>
+            </w:pPr>
+            <w:r>
+              <w:rPr>
+                <w:sz w:val="18"/>
+              </w:rPr>
+              <w:t>`deposited output only`</w:t>
+            </w:r>
+          </w:p>
+        </w:tc>
+        <w:tc>
+          <w:tcPr>
+            <w:tcW w:type="dxa" w:w="5040"/>
+          </w:tcPr>
+          <w:p>
+            <w:pPr>
+              <w:keepNext/>
+            </w:pPr>
+            <w:r>
+              <w:rPr>
+                <w:sz w:val="18"/>
+              </w:rPr>
+              <w:t>the only deposited files are the target outputs (outcome leakage)</w:t>
+            </w:r>
+          </w:p>
+        </w:tc>
+      </w:tr>
+      <w:tr>
+        <w:tc>
+          <w:tcPr>
+            <w:tcW w:type="dxa" w:w="5040"/>
+          </w:tcPr>
+          <w:p>
+            <w:pPr>
+              <w:keepNext/>
+            </w:pPr>
+            <w:r>
+              <w:rPr>
+                <w:sz w:val="18"/>
+              </w:rPr>
+              <w:t>`code only deposit`</w:t>
+            </w:r>
+          </w:p>
+        </w:tc>
+        <w:tc>
+          <w:tcPr>
+            <w:tcW w:type="dxa" w:w="5040"/>
+          </w:tcPr>
+          <w:p>
+            <w:pPr>
+              <w:keepNext/>
+            </w:pPr>
+            <w:r>
+              <w:rPr>
+                <w:sz w:val="18"/>
+              </w:rPr>
+              <w:t>the only named deposit is source code (blocked by the firewall)</w:t>
+            </w:r>
+          </w:p>
+        </w:tc>
+      </w:tr>
+      <w:tr>
+        <w:tc>
+          <w:tcPr>
+            <w:tcW w:type="dxa" w:w="5040"/>
+          </w:tcPr>
+          <w:p>
+            <w:pPr>
+              <w:keepNext w:val="0"/>
+            </w:pPr>
+            <w:r>
+              <w:rPr>
+                <w:sz w:val="18"/>
+              </w:rPr>
+              <w:t>`primary G1 no` / `primary G2 no`</w:t>
+            </w:r>
+          </w:p>
+        </w:tc>
+        <w:tc>
+          <w:tcPr>
+            <w:tcW w:type="dxa" w:w="5040"/>
+          </w:tcPr>
+          <w:p>
+            <w:pPr>
+              <w:keepNext w:val="0"/>
+            </w:pPr>
+            <w:r>
+              <w:rPr>
+                <w:sz w:val="18"/>
+              </w:rPr>
+              <w:t>fails the unchanged computational gates</w:t>
+            </w:r>
+          </w:p>
+        </w:tc>
+      </w:tr>
+    </w:tbl>
+    <w:p>
+      <w:r>
+        <w:t>Exclusion under this amendment is a **sampling frame restriction**, not a G3</w:t>
+      </w:r>
+    </w:p>
+    <w:p>
+      <w:r>
+        <w:t>study outcome. The main-sample estimand therefore becomes reconstruction</w:t>
+      </w:r>
+    </w:p>
+    <w:p>
+      <w:r>
+        <w:t>success among computational papers with immediately obtainable deposited</w:t>
+      </w:r>
+    </w:p>
+    <w:p>
+      <w:r>
+        <w:t>analysis data, and every manuscript statement of the estimand must say so.</w:t>
+      </w:r>
+    </w:p>
+    <w:p>
+      <w:pPr>
+        <w:pStyle w:val="Heading2"/>
+      </w:pPr>
+      <w:r>
+        <w:t>Accessibility layer</w:t>
+      </w:r>
+    </w:p>
+    <w:p>
+      <w:r>
+        <w:t>Papers excluded for access reasons after G1 = yes and G2 != no are retained in</w:t>
+      </w:r>
+    </w:p>
+    <w:p>
+      <w:r>
+        <w:t>`data/adjudication/accessibility_gate_failed_*.json` with class, route</w:t>
+      </w:r>
+    </w:p>
+    <w:p>
+      <w:r>
+        <w:t>evidence and the deposit statement segment IDs. The seven provisional pilot</w:t>
+      </w:r>
+    </w:p>
+    <w:p>
+      <w:r>
+        <w:t>papers are the first members of this layer (`ACCESSIBILITY_GATE_FAILED`). This</w:t>
+      </w:r>
+    </w:p>
+    <w:p>
+      <w:r>
+        <w:t>layer is an audit sample of pre-reproducibility access barriers for an</w:t>
+      </w:r>
+    </w:p>
+    <w:p>
+      <w:r>
+        <w:t>auxiliary analysis or a separate paper. **No reconstruction success or failure</w:t>
+      </w:r>
+    </w:p>
+    <w:p>
+      <w:r>
+        <w:t>rate may be computed from it**, because no member reached a reconstruction</w:t>
+      </w:r>
+    </w:p>
+    <w:p>
+      <w:r>
+        <w:t>attempt; the validation code rejects any rate field in the layer record.</w:t>
+      </w:r>
+    </w:p>
+    <w:p>
+      <w:pPr>
+        <w:pStyle w:val="Heading2"/>
+      </w:pPr>
+      <w:r>
+        <w:t>Sequence</w:t>
+      </w:r>
+    </w:p>
+    <w:p>
+      <w:r>
+        <w:t>1. Freeze this amendment (SHA-256 + RFC 3161 receipt) before any screening.</w:t>
+      </w:r>
+    </w:p>
+    <w:p>
+      <w:r>
+        <w:t>2. Screen candidates in the unchanged deterministic order per stratum,</w:t>
+      </w:r>
+    </w:p>
+    <w:p>
+      <w:r>
+        <w:t xml:space="preserve">   retaining every listing response and every exclusion reason.</w:t>
+      </w:r>
+    </w:p>
+    <w:p>
+      <w:r>
+        <w:t>3. Record primary G1–G5 for the first deposit-eligible candidate per stratum</w:t>
+      </w:r>
+    </w:p>
+    <w:p>
+      <w:r>
+        <w:t xml:space="preserve">   as a delegated assessment pending author verification.</w:t>
+      </w:r>
+    </w:p>
+    <w:p>
+      <w:r>
+        <w:t>4. Only then freeze pilot selection under the amended criterion.</w:t>
       </w:r>
     </w:p>
     <w:p>
@@ -2461,6 +3183,76 @@
       </w:r>
     </w:p>
     <w:p>
+      <w:r>
+        <w:t>Amendment AMEND-2026-09-24-03** (`AMENDMENT_AMEND-2026-09-24-03_deposited_data_criterion.md`,</w:t>
+      </w:r>
+    </w:p>
+    <w:p>
+      <w:r>
+        <w:t>hash-frozen and RFC 3161 timestamped before any screening under it) restricts</w:t>
+      </w:r>
+    </w:p>
+    <w:p>
+      <w:r>
+        <w:t>the main reconstruction sample to papers whose deposited analysis data a third</w:t>
+      </w:r>
+    </w:p>
+    <w:p>
+      <w:r>
+        <w:t>party can obtain lawfully and immediately. Under the amendment, author-request,</w:t>
+      </w:r>
+    </w:p>
+    <w:p>
+      <w:r>
+        <w:t>application-required, institutional-licence, size-unannounced, above-cap,</w:t>
+      </w:r>
+    </w:p>
+    <w:p>
+      <w:r>
+        <w:t>listing-unavailable and output-only deposits are sampling-frame exclusions</w:t>
+      </w:r>
+    </w:p>
+    <w:p>
+      <w:r>
+        <w:t>recorded with their class, not G3 study outcomes. Papers that pass G1/G2 but</w:t>
+      </w:r>
+    </w:p>
+    <w:p>
+      <w:r>
+        <w:t>fail the amended access criterion form the `ACCESSIBILITY_GATE_FAILED` layer</w:t>
+      </w:r>
+    </w:p>
+    <w:p>
+      <w:r>
+        <w:t>(`data/adjudication/accessibility_gate_failed_*.json`): an audit sample of</w:t>
+      </w:r>
+    </w:p>
+    <w:p>
+      <w:r>
+        <w:t>pre-reproducibility access barriers for an auxiliary analysis or a separate</w:t>
+      </w:r>
+    </w:p>
+    <w:p>
+      <w:r>
+        <w:t>paper, from which no reconstruction success or failure rate may be computed</w:t>
+      </w:r>
+    </w:p>
+    <w:p>
+      <w:r>
+        <w:t>because no member reached a reconstruction attempt. The seven papers of the</w:t>
+      </w:r>
+    </w:p>
+    <w:p>
+      <w:r>
+        <w:t>provisional pilot `DEV-2026-09-24-02` are the first members of that layer and</w:t>
+      </w:r>
+    </w:p>
+    <w:p>
+      <w:r>
+        <w:t>are not in the commercial-software reproducibility sample.</w:t>
+      </w:r>
+    </w:p>
+    <w:p>
       <w:pPr>
         <w:pStyle w:val="Heading2"/>
       </w:pPr>

</xml_diff>

<commit_message>
Freeze AMEND-2026-09-25-04 (pilot role, investigator verification, ten-field prospective freeze) and add streaming ENA/Zenodo acquisition
Co-Authored-By: Tatsuki Onishi <bougtoir@gmail.com>
</commit_message>
<xml_diff>
--- a/paper2_reconstruction/manuscript/Supplement_protocols_DRAFT_EN.docx
+++ b/paper2_reconstruction/manuscript/Supplement_protocols_DRAFT_EN.docx
@@ -1475,6 +1475,547 @@
     <w:p>
       <w:r>
         <w:t>4. Only then freeze pilot selection under the amended criterion.</w:t>
+      </w:r>
+    </w:p>
+    <w:p>
+      <w:r>
+        <w:br w:type="page"/>
+      </w:r>
+    </w:p>
+    <w:p>
+      <w:pPr>
+        <w:pStyle w:val="Heading1"/>
+      </w:pPr>
+      <w:r>
+        <w:t>Protocol amendment AMEND-2026-09-25-04: pilot role, investigator verification and prospective target freeze</w:t>
+      </w:r>
+    </w:p>
+    <w:p>
+      <w:r>
+        <w:t>Status: investigator-instructed amendment, hash-frozen before any candidate</w:t>
+      </w:r>
+    </w:p>
+    <w:p>
+      <w:r>
+        <w:t>selected under AMEND-2026-09-24-03 is verified, frozen or reconstructed.</w:t>
+      </w:r>
+    </w:p>
+    <w:p>
+      <w:r>
+        <w:t>Applies to every pilot and main-study record written after the freeze.</w:t>
+      </w:r>
+    </w:p>
+    <w:p>
+      <w:pPr>
+        <w:pStyle w:val="Heading2"/>
+      </w:pPr>
+      <w:r>
+        <w:t>Basis</w:t>
+      </w:r>
+    </w:p>
+    <w:p>
+      <w:r>
+        <w:t>On 2026-09-25 the principal investigator instructed that (1) the seven</w:t>
+      </w:r>
+    </w:p>
+    <w:p>
+      <w:r>
+        <w:t>candidates selected under AMEND-2026-09-24-03 are a prospective pilot /</w:t>
+      </w:r>
+    </w:p>
+    <w:p>
+      <w:r>
+        <w:t>pipeline-validation set and not the main analysis sample; (2) G1–G5</w:t>
+      </w:r>
+    </w:p>
+    <w:p>
+      <w:r>
+        <w:t>verification and a prospective target specification must be complete for all</w:t>
+      </w:r>
+    </w:p>
+    <w:p>
+      <w:r>
+        <w:t>seven before any blind reconstruction begins; (3) the verifier is the</w:t>
+      </w:r>
+    </w:p>
+    <w:p>
+      <w:r>
+        <w:t>research team, so records must say "investigator verification" or "human</w:t>
+      </w:r>
+    </w:p>
+    <w:p>
+      <w:r>
+        <w:t>adjudication", not "author verification", and original authors are not</w:t>
+      </w:r>
+    </w:p>
+    <w:p>
+      <w:r>
+        <w:t>contacted for the primary reconstruction protocol; (4) accessibility and</w:t>
+      </w:r>
+    </w:p>
+    <w:p>
+      <w:r>
+        <w:t>screening failures stay in the full-corpus attrition layer with</w:t>
+      </w:r>
+    </w:p>
+    <w:p>
+      <w:r>
+        <w:t>machine-readable reasons; (5)–(6) the deposited-data and leakage rules of</w:t>
+      </w:r>
+    </w:p>
+    <w:p>
+      <w:r>
+        <w:t>AMEND-2026-09-24-03 remain in force; (7) ten fields are frozen per pilot paper</w:t>
+      </w:r>
+    </w:p>
+    <w:p>
+      <w:r>
+        <w:t>before reconstruction; (9) pilot results are used only to find procedural</w:t>
+      </w:r>
+    </w:p>
+    <w:p>
+      <w:r>
+        <w:t>defects, never to raise the observed success rate; (12) no Paper III analysis</w:t>
+      </w:r>
+    </w:p>
+    <w:p>
+      <w:r>
+        <w:t>is performed.</w:t>
+      </w:r>
+    </w:p>
+    <w:p>
+      <w:pPr>
+        <w:pStyle w:val="Heading2"/>
+      </w:pPr>
+      <w:r>
+        <w:t>1. Terminology</w:t>
+      </w:r>
+    </w:p>
+    <w:p>
+      <w:r>
+        <w:t>`investigator_verification` replaces `author_verification` as the key and</w:t>
+      </w:r>
+    </w:p>
+    <w:p>
+      <w:r>
+        <w:t>phrase for the research team's review of delegated (Devin) G1–G5 gates.</w:t>
+      </w:r>
+    </w:p>
+    <w:p>
+      <w:r>
+        <w:t>Records written before this amendment keep their original key; readers accept</w:t>
+      </w:r>
+    </w:p>
+    <w:p>
+      <w:r>
+        <w:t>both. "Author" is reserved for the original study authors and for the</w:t>
+      </w:r>
+    </w:p>
+    <w:p>
+      <w:r>
+        <w:t>investigators' own authorship of this study. The primary reconstruction</w:t>
+      </w:r>
+    </w:p>
+    <w:p>
+      <w:r>
+        <w:t>protocol never contacts original authors; author clarification is not an</w:t>
+      </w:r>
+    </w:p>
+    <w:p>
+      <w:r>
+        <w:t>allowed resource.</w:t>
+      </w:r>
+    </w:p>
+    <w:p>
+      <w:pPr>
+        <w:pStyle w:val="Heading2"/>
+      </w:pPr>
+      <w:r>
+        <w:t>2. Role of the seven AMEND-2026-09-24-03 candidates</w:t>
+      </w:r>
+    </w:p>
+    <w:p>
+      <w:r>
+        <w:t>The candidates selected under AMEND-2026-09-24-03 form the</w:t>
+      </w:r>
+    </w:p>
+    <w:p>
+      <w:r>
+        <w:t>`PROSPECTIVE_PILOT` set: `main_sample_membership =</w:t>
+      </w:r>
+    </w:p>
+    <w:p>
+      <w:r>
+        <w:t>excluded_from_primary_denominator`. Their outcomes validate the pipeline</w:t>
+      </w:r>
+    </w:p>
+    <w:p>
+      <w:r>
+        <w:t>(target rules, tolerance rules, failure taxonomy, logging schema, resource</w:t>
+      </w:r>
+    </w:p>
+    <w:p>
+      <w:r>
+        <w:t>ceilings) and are reported descriptively. They enter no primary</w:t>
+      </w:r>
+    </w:p>
+    <w:p>
+      <w:r>
+        <w:t>reconstruction-rate numerator or denominator. The main cohort is drawn after</w:t>
+      </w:r>
+    </w:p>
+    <w:p>
+      <w:r>
+        <w:t>the post-pilot protocol freeze from the full eligible population by the SAP's</w:t>
+      </w:r>
+    </w:p>
+    <w:p>
+      <w:r>
+        <w:t>precision calculation and stratified random sampling (target N ≈ 100), with</w:t>
+      </w:r>
+    </w:p>
+    <w:p>
+      <w:r>
+        <w:t>pilot papers removed from the sampling frame.</w:t>
+      </w:r>
+    </w:p>
+    <w:p>
+      <w:pPr>
+        <w:pStyle w:val="Heading2"/>
+      </w:pPr>
+      <w:r>
+        <w:t>3. Additional exclusion class</w:t>
+      </w:r>
+    </w:p>
+    <w:tbl>
+      <w:tblPr>
+        <w:tblStyle w:val="TableGrid"/>
+        <w:tblW w:type="auto" w:w="0"/>
+        <w:tblLook w:firstColumn="1" w:firstRow="1" w:lastColumn="0" w:lastRow="0" w:noHBand="0" w:noVBand="1" w:val="04A0"/>
+      </w:tblPr>
+      <w:tblGrid>
+        <w:gridCol w:w="5040"/>
+        <w:gridCol w:w="5040"/>
+      </w:tblGrid>
+      <w:tr>
+        <w:tc>
+          <w:tcPr>
+            <w:tcW w:type="dxa" w:w="5040"/>
+          </w:tcPr>
+          <w:p>
+            <w:pPr>
+              <w:keepNext/>
+            </w:pPr>
+            <w:r>
+              <w:rPr>
+                <w:sz w:val="18"/>
+              </w:rPr>
+              <w:t>class</w:t>
+            </w:r>
+          </w:p>
+        </w:tc>
+        <w:tc>
+          <w:tcPr>
+            <w:tcW w:type="dxa" w:w="5040"/>
+          </w:tcPr>
+          <w:p>
+            <w:pPr>
+              <w:keepNext/>
+            </w:pPr>
+            <w:r>
+              <w:rPr>
+                <w:sz w:val="18"/>
+              </w:rPr>
+              <w:t>meaning</w:t>
+            </w:r>
+          </w:p>
+        </w:tc>
+      </w:tr>
+      <w:tr>
+        <w:tc>
+          <w:tcPr>
+            <w:tcW w:type="dxa" w:w="5040"/>
+          </w:tcPr>
+          <w:p>
+            <w:pPr>
+              <w:keepNext w:val="0"/>
+            </w:pPr>
+            <w:r>
+              <w:rPr>
+                <w:sz w:val="18"/>
+              </w:rPr>
+              <w:t>`deposited input mismatch`</w:t>
+            </w:r>
+          </w:p>
+        </w:tc>
+        <w:tc>
+          <w:tcPr>
+            <w:tcW w:type="dxa" w:w="5040"/>
+          </w:tcPr>
+          <w:p>
+            <w:pPr>
+              <w:keepNext w:val="0"/>
+            </w:pPr>
+            <w:r>
+              <w:rPr>
+                <w:sz w:val="18"/>
+              </w:rPr>
+              <w:t>the named deposit resolves anonymously but its listed samples/files are not the datasets the article reports analysing (identifier sets disjoint or incomplete); the target inputs are therefore not deposited under the named route</w:t>
+            </w:r>
+          </w:p>
+        </w:tc>
+      </w:tr>
+    </w:tbl>
+    <w:p>
+      <w:r>
+        <w:t>The class is recorded with the article's own identifiers and the deposit's</w:t>
+      </w:r>
+    </w:p>
+    <w:p>
+      <w:r>
+        <w:t>listed identifiers as evidence. It is a sampling-frame restriction like every</w:t>
+      </w:r>
+    </w:p>
+    <w:p>
+      <w:r>
+        <w:t>AMEND-2026-09-24-03 class, not a reconstruction outcome, and the deterministic</w:t>
+      </w:r>
+    </w:p>
+    <w:p>
+      <w:r>
+        <w:t>per-stratum chain resumes at the next rank.</w:t>
+      </w:r>
+    </w:p>
+    <w:p>
+      <w:pPr>
+        <w:pStyle w:val="Heading2"/>
+      </w:pPr>
+      <w:r>
+        <w:t>4. Prospective freeze fields (per pilot and per main-study paper)</w:t>
+      </w:r>
+    </w:p>
+    <w:p>
+      <w:r>
+        <w:t>Before any slot is opened, the target manifest records, and the freeze hashes:</w:t>
+      </w:r>
+    </w:p>
+    <w:p>
+      <w:r>
+        <w:t>1. `exact_target` — the numerical value(s) exactly as published, with units</w:t>
+      </w:r>
+    </w:p>
+    <w:p>
+      <w:r>
+        <w:t xml:space="preserve">   and reporting precision;</w:t>
+      </w:r>
+    </w:p>
+    <w:p>
+      <w:r>
+        <w:t>2. `target_location` — section, table, figure or sentence, with the retained</w:t>
+      </w:r>
+    </w:p>
+    <w:p>
+      <w:r>
+        <w:t xml:space="preserve">   segment ID and verbatim quote;</w:t>
+      </w:r>
+    </w:p>
+    <w:p>
+      <w:r>
+        <w:t>3. `required_inputs` — repository, accession, file names, versions or</w:t>
+      </w:r>
+    </w:p>
+    <w:p>
+      <w:r>
+        <w:t xml:space="preserve">   run/sample identifiers, bytes and SHA-256 where retained;</w:t>
+      </w:r>
+    </w:p>
+    <w:p>
+      <w:r>
+        <w:t>4. `allowed_resources` — free software, public references and the package</w:t>
+      </w:r>
+    </w:p>
+    <w:p>
+      <w:r>
+        <w:t xml:space="preserve">   contents served to every slot;</w:t>
+      </w:r>
+    </w:p>
+    <w:p>
+      <w:r>
+        <w:t>5. `blocked_original_artifacts` — original code, repositories, notebooks,</w:t>
+      </w:r>
+    </w:p>
+    <w:p>
+      <w:r>
+        <w:t xml:space="preserve">   containers, processed result files and author clarification, all withheld;</w:t>
+      </w:r>
+    </w:p>
+    <w:p>
+      <w:r>
+        <w:t>6. `comparison_metric` — the TOLERANCE_RULES scorer applied;</w:t>
+      </w:r>
+    </w:p>
+    <w:p>
+      <w:r>
+        <w:t>7. `numerical_agreement_criterion` — the prospective numeric rule with</w:t>
+      </w:r>
+    </w:p>
+    <w:p>
+      <w:r>
+        <w:t xml:space="preserve">   reporting precision;</w:t>
+      </w:r>
+    </w:p>
+    <w:p>
+      <w:r>
+        <w:t>8. `conclusion_criterion` — the minimal target-linked claim and how agreement</w:t>
+      </w:r>
+    </w:p>
+    <w:p>
+      <w:r>
+        <w:t xml:space="preserve">   or disagreement with it is decided;</w:t>
+      </w:r>
+    </w:p>
+    <w:p>
+      <w:r>
+        <w:t>9. `resource_ceiling` — wall-clock, model-call, token and byte ceilings per</w:t>
+      </w:r>
+    </w:p>
+    <w:p>
+      <w:r>
+        <w:t xml:space="preserve">   slot;</w:t>
+      </w:r>
+    </w:p>
+    <w:p>
+      <w:r>
+        <w:t>10. `stopping_rule` — what ends a slot (report, ceiling, unresolved input,</w:t>
+      </w:r>
+    </w:p>
+    <w:p>
+      <w:r>
+        <w:t xml:space="preserve">    specification gap) and how each end state is labelled.</w:t>
+      </w:r>
+    </w:p>
+    <w:p>
+      <w:r>
+        <w:t>Known specification gaps (for example an undisclosed train/test split) are</w:t>
+      </w:r>
+    </w:p>
+    <w:p>
+      <w:r>
+        <w:t>written into the manifest before the slot opens; a gap is a recorded</w:t>
+      </w:r>
+    </w:p>
+    <w:p>
+      <w:r>
+        <w:t>`specification_insufficient` state, never a reason to substitute an easier</w:t>
+      </w:r>
+    </w:p>
+    <w:p>
+      <w:r>
+        <w:t>target after the run.</w:t>
+      </w:r>
+    </w:p>
+    <w:p>
+      <w:pPr>
+        <w:pStyle w:val="Heading2"/>
+      </w:pPr>
+      <w:r>
+        <w:t>5. Investigator verification record</w:t>
+      </w:r>
+    </w:p>
+    <w:p>
+      <w:r>
+        <w:t>For every pilot paper the investigator team records, gate by gate, `confirm`</w:t>
+      </w:r>
+    </w:p>
+    <w:p>
+      <w:r>
+        <w:t>or `overturn` of the delegated value with a reason, after re-reading the cited</w:t>
+      </w:r>
+    </w:p>
+    <w:p>
+      <w:r>
+        <w:t>retained segments and re-checking every quote verbatim. Overturns are kept</w:t>
+      </w:r>
+    </w:p>
+    <w:p>
+      <w:r>
+        <w:t>alongside the delegated value. The record is validated against the retained</w:t>
+      </w:r>
+    </w:p>
+    <w:p>
+      <w:r>
+        <w:t>text and the amended record before the target freeze may reference it.</w:t>
+      </w:r>
+    </w:p>
+    <w:p>
+      <w:pPr>
+        <w:pStyle w:val="Heading2"/>
+      </w:pPr>
+      <w:r>
+        <w:t>6. Paper III boundary</w:t>
+      </w:r>
+    </w:p>
+    <w:p>
+      <w:r>
+        <w:t>No multiverse analysis, no deliberate alternative reasonable implementation,</w:t>
+      </w:r>
+    </w:p>
+    <w:p>
+      <w:r>
+        <w:t>no robustness perturbation and no test of whether an undocumented</w:t>
+      </w:r>
+    </w:p>
+    <w:p>
+      <w:r>
+        <w:t>implementation choice changes a conclusion is performed in Paper II. The</w:t>
+      </w:r>
+    </w:p>
+    <w:p>
+      <w:r>
+        <w:t>original-code reveal after the blind freeze is descriptive only.</w:t>
+      </w:r>
+    </w:p>
+    <w:p>
+      <w:pPr>
+        <w:pStyle w:val="Heading2"/>
+      </w:pPr>
+      <w:r>
+        <w:t>Sequence</w:t>
+      </w:r>
+    </w:p>
+    <w:p>
+      <w:r>
+        <w:t>1. Freeze this amendment (SHA-256 + RFC 3161 receipt).</w:t>
+      </w:r>
+    </w:p>
+    <w:p>
+      <w:r>
+        <w:t>2. Complete deposit inspection, investigator G1–G5 verification and the ten</w:t>
+      </w:r>
+    </w:p>
+    <w:p>
+      <w:r>
+        <w:t xml:space="preserve">   freeze fields for all seven pilot candidates; resume a stratum's chain</w:t>
+      </w:r>
+    </w:p>
+    <w:p>
+      <w:r>
+        <w:t xml:space="preserve">   where a candidate is excluded.</w:t>
+      </w:r>
+    </w:p>
+    <w:p>
+      <w:r>
+        <w:t>3. Freeze the pilot target manifest (SHA-256 + RFC 3161), then run three</w:t>
+      </w:r>
+    </w:p>
+    <w:p>
+      <w:r>
+        <w:t xml:space="preserve">   independent blind slots per paper.</w:t>
+      </w:r>
+    </w:p>
+    <w:p>
+      <w:r>
+        <w:t>4. Pilot review; freeze the final protocol and SAP; select the main cohort.</w:t>
       </w:r>
     </w:p>
     <w:p>
@@ -2853,7 +3394,7 @@
     </w:p>
     <w:p>
       <w:r>
-        <w:t>`DEV-2026-09-24-02` with author verification of G1–G5 still pending; its runs are</w:t>
+        <w:t>`DEV-2026-09-24-02` with investigator verification of G1–G5 still pending; its runs are</w:t>
       </w:r>
     </w:p>
     <w:p>
@@ -3144,7 +3685,7 @@
     </w:p>
     <w:p>
       <w:r>
-        <w:t>If the author delegates the first pass, the delegated gates are recorded as a</w:t>
+        <w:t>If the investigator delegates the first pass, the delegated gates are recorded as a</w:t>
       </w:r>
     </w:p>
     <w:p>
@@ -3159,12 +3700,12 @@
     </w:p>
     <w:p>
       <w:r>
-        <w:t>unassessed and no pilot selection is frozen until the author verifies or overturns</w:t>
-      </w:r>
-    </w:p>
-    <w:p>
-      <w:r>
-        <w:t>each gate. Delegated or author adjudication may skip a candidate only for absent</w:t>
+        <w:t>unassessed and no pilot selection is frozen until the investigator team verifies or overturns</w:t>
+      </w:r>
+    </w:p>
+    <w:p>
+      <w:r>
+        <w:t>each gate. Delegated or human adjudication may skip a candidate only for absent</w:t>
       </w:r>
     </w:p>
     <w:p>

</xml_diff>

<commit_message>
Freeze prospective pilot, execute and seal 21 blind slots, procedurally review, freeze protocol/SAP and draw main cohort
Co-Authored-By: Tatsuki Onishi <bougtoir@gmail.com>
</commit_message>
<xml_diff>
--- a/paper2_reconstruction/manuscript/Supplement_protocols_DRAFT_EN.docx
+++ b/paper2_reconstruction/manuscript/Supplement_protocols_DRAFT_EN.docx
@@ -2028,77 +2028,471 @@
         <w:pStyle w:val="Heading1"/>
       </w:pPr>
       <w:r>
-        <w:t>Commercial software policy</w:t>
-      </w:r>
-    </w:p>
-    <w:p>
-      <w:r>
-        <w:t>DRAFT — NOT FROZEN</w:t>
-      </w:r>
-    </w:p>
-    <w:p>
-      <w:r>
-        <w:t>Study-specific commercial software purchase equals zero. Do not use SAS, SPSS,</w:t>
-      </w:r>
-    </w:p>
-    <w:p>
-      <w:r>
-        <w:t>Stata, MATLAB, proprietary modules, paid institutional entitlements or trials</w:t>
-      </w:r>
-    </w:p>
-    <w:p>
-      <w:r>
-        <w:t>that cannot be replicated by a reader under the policy. Do not buy a licence.</w:t>
-      </w:r>
-    </w:p>
-    <w:p>
-      <w:r>
-        <w:t>A named commercial application is not automatic failure. Implement a sufficiently</w:t>
-      </w:r>
-    </w:p>
-    <w:p>
-      <w:r>
-        <w:t>specified, software-independent method using free/open-source tools; record</w:t>
-      </w:r>
-    </w:p>
-    <w:p>
-      <w:r>
-        <w:t>library versions and observable assumptions. Essential unreconstructable</w:t>
-      </w:r>
-    </w:p>
-    <w:p>
-      <w:r>
-        <w:t>proprietary function = F02; required unavailable version = F03; underspecified</w:t>
-      </w:r>
-    </w:p>
-    <w:p>
-      <w:r>
-        <w:t>procedure = the applicable specification code, not automatically F02.</w:t>
-      </w:r>
-    </w:p>
-    <w:p>
-      <w:r>
-        <w:t>Dependencies must be vetted as general-purpose tools, pinned with hashes and</w:t>
-      </w:r>
-    </w:p>
-    <w:p>
-      <w:r>
-        <w:t>licences, and must not contain the paper's original implementation. The same</w:t>
-      </w:r>
-    </w:p>
-    <w:p>
-      <w:r>
-        <w:t>dependency policy applies to every run. Agent/API costs, computing costs and</w:t>
-      </w:r>
-    </w:p>
-    <w:p>
-      <w:r>
-        <w:t>journal APCs are distinct from software purchase; report actual usage or unknown.</w:t>
-      </w:r>
-    </w:p>
-    <w:p>
-      <w:r>
-        <w:t>This draft does not authorize a new paid resource commitment.</w:t>
+        <w:t>Protocol amendment AMEND-2026-09-25-05: post-pilot final protocol freeze</w:t>
+      </w:r>
+    </w:p>
+    <w:p>
+      <w:r>
+        <w:t>Status: written after the seven-paper prospective pilot was executed and</w:t>
+      </w:r>
+    </w:p>
+    <w:p>
+      <w:r>
+        <w:t>sealed (blind outcome SHA-256</w:t>
+      </w:r>
+    </w:p>
+    <w:p>
+      <w:r>
+        <w:t>`485967ff8a1caf85c1d9b1bc102ada617219e3636ea22b7dcbbc5337bb81f3db`) and</w:t>
+      </w:r>
+    </w:p>
+    <w:p>
+      <w:r>
+        <w:t>after the prespecified procedural review `PILOT-REVIEW-2026-09-25`, before any</w:t>
+      </w:r>
+    </w:p>
+    <w:p>
+      <w:r>
+        <w:t>pilot value was adjudicated, before any original implementation was revealed,</w:t>
+      </w:r>
+    </w:p>
+    <w:p>
+      <w:r>
+        <w:t>and before any main-study paper was selected. It freezes the reconstruction</w:t>
+      </w:r>
+    </w:p>
+    <w:p>
+      <w:r>
+        <w:t>protocol, target rules, tolerance rules, failure taxonomy, logging schema and</w:t>
+      </w:r>
+    </w:p>
+    <w:p>
+      <w:r>
+        <w:t>resource ceilings for the main study. Hashes of every frozen document are in</w:t>
+      </w:r>
+    </w:p>
+    <w:p>
+      <w:r>
+        <w:t>`data/adjudication/protocol_freeze_20260925.json`, RFC 3161 timestamped under</w:t>
+      </w:r>
+    </w:p>
+    <w:p>
+      <w:r>
+        <w:t>`data/raw/protocol-freeze-20260925/`.</w:t>
+      </w:r>
+    </w:p>
+    <w:p>
+      <w:pPr>
+        <w:pStyle w:val="Heading2"/>
+      </w:pPr>
+      <w:r>
+        <w:t>Basis</w:t>
+      </w:r>
+    </w:p>
+    <w:p>
+      <w:r>
+        <w:t>The procedural review (data/adjudication/pilot_procedural_review_20260925.json)</w:t>
+      </w:r>
+    </w:p>
+    <w:p>
+      <w:r>
+        <w:t>examined only harness behaviour: stop reasons, ceilings, journal completeness,</w:t>
+      </w:r>
+    </w:p>
+    <w:p>
+      <w:r>
+        <w:t>report schema and value provenance. It computed no success or failure rate and</w:t>
+      </w:r>
+    </w:p>
+    <w:p>
+      <w:r>
+        <w:t>compared no observed value with a publication. Its findings and the rule each</w:t>
+      </w:r>
+    </w:p>
+    <w:p>
+      <w:r>
+        <w:t>receives are below. No target, tolerance or conclusion rule changes; nothing</w:t>
+      </w:r>
+    </w:p>
+    <w:p>
+      <w:r>
+        <w:t>below can raise or lower the observed success rate of any pilot slot, because</w:t>
+      </w:r>
+    </w:p>
+    <w:p>
+      <w:r>
+        <w:t>pilot slots are not re-run and remain outside the primary denominator.</w:t>
+      </w:r>
+    </w:p>
+    <w:p>
+      <w:pPr>
+        <w:pStyle w:val="Heading2"/>
+      </w:pPr>
+      <w:r>
+        <w:t>1. PD-01 — resource ceilings made internally consistent</w:t>
+      </w:r>
+    </w:p>
+    <w:p>
+      <w:r>
+        <w:t>Sixteen of twenty-one pilot slots stopped at the cumulative provider-token</w:t>
+      </w:r>
+    </w:p>
+    <w:p>
+      <w:r>
+        <w:t>ceiling (400,000 tokens) after a median of 23.5 tool calls and at most 139 s of</w:t>
+      </w:r>
+    </w:p>
+    <w:p>
+      <w:r>
+        <w:t>a 14,400 s wall ceiling; no slot reached the 40-call ceiling and no slot ran a</w:t>
+      </w:r>
+    </w:p>
+    <w:p>
+      <w:r>
+        <w:t>heavy computation. The token ceiling therefore silently overrode the tool-call</w:t>
+      </w:r>
+    </w:p>
+    <w:p>
+      <w:r>
+        <w:t>and wall ceilings the protocol described as binding. The final ceiling sets the</w:t>
+      </w:r>
+    </w:p>
+    <w:p>
+      <w:r>
+        <w:t>cumulative provider-token ceiling to **1,500,000 tokens per slot**, the value</w:t>
+      </w:r>
+    </w:p>
+    <w:p>
+      <w:r>
+        <w:t>that makes the 40-call ceiling attainable at the 95th-percentile observed</w:t>
+      </w:r>
+    </w:p>
+    <w:p>
+      <w:r>
+        <w:t>context size (31,844 prompt tokens × 40 = 1,273,760, rounded up to the next</w:t>
+      </w:r>
+    </w:p>
+    <w:p>
+      <w:r>
+        <w:t>500,000). Wall (14,400 s), step (3,600 s), tool-call (40), completion (8,192),</w:t>
+      </w:r>
+    </w:p>
+    <w:p>
+      <w:r>
+        <w:t>memory (3 GiB), single CPU, no network and the 64 MiB artifact export cap are</w:t>
+      </w:r>
+    </w:p>
+    <w:p>
+      <w:r>
+        <w:t>unchanged. The ceiling is a harness consistency correction and is applied to</w:t>
+      </w:r>
+    </w:p>
+    <w:p>
+      <w:r>
+        <w:t>all main-study slots identically; it is never adjusted per paper.</w:t>
+      </w:r>
+    </w:p>
+    <w:p>
+      <w:pPr>
+        <w:pStyle w:val="Heading2"/>
+      </w:pPr>
+      <w:r>
+        <w:t>2. PD-02 — failure codes are taxonomy identifiers</w:t>
+      </w:r>
+    </w:p>
+    <w:p>
+      <w:r>
+        <w:t>Reports carried free-text tokens (`NO_ANALYSIS_EXECUTED`,</w:t>
+      </w:r>
+    </w:p>
+    <w:p>
+      <w:r>
+        <w:t>`RUN_TERMINATED_LENGTH_LIMIT`, `TARGET_NOT_OBSERVED`) in `failure_codes`.</w:t>
+      </w:r>
+    </w:p>
+    <w:p>
+      <w:r>
+        <w:t>Final rule: `failure_codes` must be identifiers `F01`–`F20` or `F99` from</w:t>
+      </w:r>
+    </w:p>
+    <w:p>
+      <w:r>
+        <w:t>FAILURE_TAXONOMY.md. Any other token is retained verbatim in the sealed report,</w:t>
+      </w:r>
+    </w:p>
+    <w:p>
+      <w:r>
+        <w:t>mapped to `F99` for tabulation, and adjudicated as *unclassified*. No code is</w:t>
+      </w:r>
+    </w:p>
+    <w:p>
+      <w:r>
+        <w:t>added to the taxonomy after this freeze.</w:t>
+      </w:r>
+    </w:p>
+    <w:p>
+      <w:pPr>
+        <w:pStyle w:val="Heading2"/>
+      </w:pPr>
+      <w:r>
+        <w:t>3. PD-03 — final report without any execution</w:t>
+      </w:r>
+    </w:p>
+    <w:p>
+      <w:r>
+        <w:t>One report was submitted before any worker execution and asserted a harness</w:t>
+      </w:r>
+    </w:p>
+    <w:p>
+      <w:r>
+        <w:t>termination that the journal does not show. Final rule: a final report with</w:t>
+      </w:r>
+    </w:p>
+    <w:p>
+      <w:r>
+        <w:t>zero journaled executions is classified `no_execution_report`. The slot counts</w:t>
+      </w:r>
+    </w:p>
+    <w:p>
+      <w:r>
+        <w:t>as attempted; L2 and L3 are `not_reached`; any `observed_value` is void; any</w:t>
+      </w:r>
+    </w:p>
+    <w:p>
+      <w:r>
+        <w:t>procedural statement in a report is checked against the journal and never</w:t>
+      </w:r>
+    </w:p>
+    <w:p>
+      <w:r>
+        <w:t>accepted from the report alone.</w:t>
+      </w:r>
+    </w:p>
+    <w:p>
+      <w:pPr>
+        <w:pStyle w:val="Heading2"/>
+      </w:pPr>
+      <w:r>
+        <w:t>4. PD-04 — value provenance is required for L3 and L4</w:t>
+      </w:r>
+    </w:p>
+    <w:p>
+      <w:r>
+        <w:t>The served publication text displays the target value, so a value transcribed</w:t>
+      </w:r>
+    </w:p>
+    <w:p>
+      <w:r>
+        <w:t>from the article is indistinguishable, in the report alone, from a computed</w:t>
+      </w:r>
+    </w:p>
+    <w:p>
+      <w:r>
+        <w:t>one. Final rule: for L3 (`execution_successful`) and L4</w:t>
+      </w:r>
+    </w:p>
+    <w:p>
+      <w:r>
+        <w:t>(`numerical_target_reproduced`) the adjudicator must locate the observed value</w:t>
+      </w:r>
+    </w:p>
+    <w:p>
+      <w:r>
+        <w:t>(to the reported precision) in a journaled execution output produced by</w:t>
+      </w:r>
+    </w:p>
+    <w:p>
+      <w:r>
+        <w:t>journaled code that reads served inputs. If it cannot be located, L3 and L4 are</w:t>
+      </w:r>
+    </w:p>
+    <w:p>
+      <w:r>
+        <w:t>`not_established` and the slot is recorded with `F15` if code exists or</w:t>
+      </w:r>
+    </w:p>
+    <w:p>
+      <w:r>
+        <w:t>`no_execution_report` otherwise. The blind is a blind to the original</w:t>
+      </w:r>
+    </w:p>
+    <w:p>
+      <w:r>
+        <w:t>implementation and its outputs, not to the publication; the manuscript states</w:t>
+      </w:r>
+    </w:p>
+    <w:p>
+      <w:r>
+        <w:t>this and reports the provenance check explicitly.</w:t>
+      </w:r>
+    </w:p>
+    <w:p>
+      <w:pPr>
+        <w:pStyle w:val="Heading2"/>
+      </w:pPr>
+      <w:r>
+        <w:t>5. Frozen documents</w:t>
+      </w:r>
+    </w:p>
+    <w:p>
+      <w:r>
+        <w:t>PROTOCOL.md, SAP.md, TOLERANCE_RULES.md, FAILURE_TAXONOMY.md,</w:t>
+      </w:r>
+    </w:p>
+    <w:p>
+      <w:r>
+        <w:t>TARGET_SELECTION_RULES.md, INFORMATION_FIREWALL.md, REVEAL_PROTOCOL.md, this</w:t>
+      </w:r>
+    </w:p>
+    <w:p>
+      <w:r>
+        <w:t>amendment and its predecessors, the logging schema (journal event kinds and the</w:t>
+      </w:r>
+    </w:p>
+    <w:p>
+      <w:r>
+        <w:t>report schema in `src/paper2/controller.py` and `src/paper2/isolation.py`) and</w:t>
+      </w:r>
+    </w:p>
+    <w:p>
+      <w:r>
+        <w:t>the final ceiling in `src/paper2/protocol_freeze.py`. Their SHA-256 values are</w:t>
+      </w:r>
+    </w:p>
+    <w:p>
+      <w:r>
+        <w:t>listed in the freeze record. After the freeze, any change to these documents</w:t>
+      </w:r>
+    </w:p>
+    <w:p>
+      <w:r>
+        <w:t>requires a new numbered amendment, and any change made after a main-study slot</w:t>
+      </w:r>
+    </w:p>
+    <w:p>
+      <w:r>
+        <w:t>has opened is reported as a deviation.</w:t>
+      </w:r>
+    </w:p>
+    <w:p>
+      <w:pPr>
+        <w:pStyle w:val="Heading2"/>
+      </w:pPr>
+      <w:r>
+        <w:t>6. Main study sampling frame</w:t>
+      </w:r>
+    </w:p>
+    <w:p>
+      <w:r>
+        <w:t>The eligible reconstruction population is every unique-PMID paper for which</w:t>
+      </w:r>
+    </w:p>
+    <w:p>
+      <w:r>
+        <w:t>Stage A (deposit statement in lawfully retained text) and exhaustive Stage B</w:t>
+      </w:r>
+    </w:p>
+    <w:p>
+      <w:r>
+        <w:t>(anonymous listing resolved, within caps, not implementation-only) record a</w:t>
+      </w:r>
+    </w:p>
+    <w:p>
+      <w:r>
+        <w:t>verified open deposit route, minus (a) the seven `PROSPECTIVE_PILOT` papers,</w:t>
+      </w:r>
+    </w:p>
+    <w:p>
+      <w:r>
+        <w:t>(b) the seven `ACCESSIBILITY_GATE_FAILED` papers, (c) every paper carrying a</w:t>
+      </w:r>
+    </w:p>
+    <w:p>
+      <w:r>
+        <w:t>machine-readable exclusion class, and (d) every paper whose retained text was</w:t>
+      </w:r>
+    </w:p>
+    <w:p>
+      <w:r>
+        <w:t>inspected for any earlier candidate review. The SAP allocation (one place per</w:t>
+      </w:r>
+    </w:p>
+    <w:p>
+      <w:r>
+        <w:t>nonempty field, remaining places by proportional-allocation deficit with</w:t>
+      </w:r>
+    </w:p>
+    <w:p>
+      <w:r>
+        <w:t>lexicographic ties, within-field order by SHA-256 of `paper2-main-v1|paper_id`)</w:t>
+      </w:r>
+    </w:p>
+    <w:p>
+      <w:r>
+        <w:t>is executed once; N_h, n_h, π_h and weights are saved before any paper's G1–G5</w:t>
+      </w:r>
+    </w:p>
+    <w:p>
+      <w:r>
+        <w:t>or target freeze begins. Each selected paper then receives the ten-field</w:t>
+      </w:r>
+    </w:p>
+    <w:p>
+      <w:r>
+        <w:t>prospective freeze of AMEND-2026-09-25-04 §4 with the same G1–G5 delegated</w:t>
+      </w:r>
+    </w:p>
+    <w:p>
+      <w:r>
+        <w:t>assessment and pending investigator verification; papers failing G1–G5,</w:t>
+      </w:r>
+    </w:p>
+    <w:p>
+      <w:r>
+        <w:t>leakage review or deposited-input matching are recorded with their class and</w:t>
+      </w:r>
+    </w:p>
+    <w:p>
+      <w:r>
+        <w:t>are not replaced (the primary estimate is reported on attempted papers with the</w:t>
+      </w:r>
+    </w:p>
+    <w:p>
+      <w:r>
+        <w:t>attrition table; the SAP's finite-population bounds cover the unattempted).</w:t>
+      </w:r>
+    </w:p>
+    <w:p>
+      <w:pPr>
+        <w:pStyle w:val="Heading2"/>
+      </w:pPr>
+      <w:r>
+        <w:t>7. Unchanged</w:t>
+      </w:r>
+    </w:p>
+    <w:p>
+      <w:r>
+        <w:t>Target selection hierarchy; tolerance rules; L1–L5 definitions and the</w:t>
+      </w:r>
+    </w:p>
+    <w:p>
+      <w:r>
+        <w:t>primary endpoint (≥ 2 valid successes among 3 fixed slots per paper); three</w:t>
+      </w:r>
+    </w:p>
+    <w:p>
+      <w:r>
+        <w:t>sequential single-VM slots; the information firewall; descriptive-only reveal;</w:t>
+      </w:r>
+    </w:p>
+    <w:p>
+      <w:r>
+        <w:t>no Paper III analysis; no original-author contact; pilot outside the primary</w:t>
+      </w:r>
+    </w:p>
+    <w:p>
+      <w:r>
+        <w:t>denominator.</w:t>
       </w:r>
     </w:p>
     <w:p>
@@ -2111,12 +2505,95 @@
         <w:pStyle w:val="Heading1"/>
       </w:pPr>
       <w:r>
+        <w:t>Commercial software policy</w:t>
+      </w:r>
+    </w:p>
+    <w:p>
+      <w:r>
+        <w:t>DRAFT — NOT FROZEN</w:t>
+      </w:r>
+    </w:p>
+    <w:p>
+      <w:r>
+        <w:t>Study-specific commercial software purchase equals zero. Do not use SAS, SPSS,</w:t>
+      </w:r>
+    </w:p>
+    <w:p>
+      <w:r>
+        <w:t>Stata, MATLAB, proprietary modules, paid institutional entitlements or trials</w:t>
+      </w:r>
+    </w:p>
+    <w:p>
+      <w:r>
+        <w:t>that cannot be replicated by a reader under the policy. Do not buy a licence.</w:t>
+      </w:r>
+    </w:p>
+    <w:p>
+      <w:r>
+        <w:t>A named commercial application is not automatic failure. Implement a sufficiently</w:t>
+      </w:r>
+    </w:p>
+    <w:p>
+      <w:r>
+        <w:t>specified, software-independent method using free/open-source tools; record</w:t>
+      </w:r>
+    </w:p>
+    <w:p>
+      <w:r>
+        <w:t>library versions and observable assumptions. Essential unreconstructable</w:t>
+      </w:r>
+    </w:p>
+    <w:p>
+      <w:r>
+        <w:t>proprietary function = F02; required unavailable version = F03; underspecified</w:t>
+      </w:r>
+    </w:p>
+    <w:p>
+      <w:r>
+        <w:t>procedure = the applicable specification code, not automatically F02.</w:t>
+      </w:r>
+    </w:p>
+    <w:p>
+      <w:r>
+        <w:t>Dependencies must be vetted as general-purpose tools, pinned with hashes and</w:t>
+      </w:r>
+    </w:p>
+    <w:p>
+      <w:r>
+        <w:t>licences, and must not contain the paper's original implementation. The same</w:t>
+      </w:r>
+    </w:p>
+    <w:p>
+      <w:r>
+        <w:t>dependency policy applies to every run. Agent/API costs, computing costs and</w:t>
+      </w:r>
+    </w:p>
+    <w:p>
+      <w:r>
+        <w:t>journal APCs are distinct from software purchase; report actual usage or unknown.</w:t>
+      </w:r>
+    </w:p>
+    <w:p>
+      <w:r>
+        <w:t>This draft does not authorize a new paid resource commitment.</w:t>
+      </w:r>
+    </w:p>
+    <w:p>
+      <w:r>
+        <w:br w:type="page"/>
+      </w:r>
+    </w:p>
+    <w:p>
+      <w:pPr>
+        <w:pStyle w:val="Heading1"/>
+      </w:pPr>
+      <w:r>
         <w:t>Failure taxonomy</w:t>
       </w:r>
     </w:p>
     <w:p>
       <w:r>
-        <w:t>DRAFT — NOT FROZEN</w:t>
+        <w:t>FROZEN 2026-09-25 by AMEND-2026-09-25-05. No code is added after the freeze.</w:t>
       </w:r>
     </w:p>
     <w:tbl>
@@ -2925,6 +3402,26 @@
     </w:p>
     <w:p>
       <w:r>
+        <w:t>Report `failure_codes` must be identifiers from this table. Any other token is</w:t>
+      </w:r>
+    </w:p>
+    <w:p>
+      <w:r>
+        <w:t>retained verbatim, tabulated as F99 and adjudicated as unclassified. A final</w:t>
+      </w:r>
+    </w:p>
+    <w:p>
+      <w:r>
+        <w:t>report with zero journaled executions is the slot state `no_execution_report`</w:t>
+      </w:r>
+    </w:p>
+    <w:p>
+      <w:r>
+        <w:t>(L2 and L3 `not_reached`, observed value void), not a taxonomy code.</w:t>
+      </w:r>
+    </w:p>
+    <w:p>
+      <w:r>
         <w:br w:type="page"/>
       </w:r>
     </w:p>
@@ -3389,22 +3886,37 @@
     </w:p>
     <w:p>
       <w:r>
-        <w:t>DRAFT — NOT FROZEN. A provisional pilot has been executed under deviation</w:t>
-      </w:r>
-    </w:p>
-    <w:p>
-      <w:r>
-        <w:t>`DEV-2026-09-24-02` with investigator verification of G1–G5 still pending; its runs are</w:t>
-      </w:r>
-    </w:p>
-    <w:p>
-      <w:r>
-        <w:t>sealed unadjudicated and excluded from the main sample. No main reconstruction</w:t>
-      </w:r>
-    </w:p>
-    <w:p>
-      <w:r>
-        <w:t>experiment has occurred.</w:t>
+        <w:t>FROZEN 2026-09-25 by AMEND-2026-09-25-05 after the seven-paper prospective</w:t>
+      </w:r>
+    </w:p>
+    <w:p>
+      <w:r>
+        <w:t>pilot (`PILOT-FREEZE-2026-09-25`) was executed, sealed and procedurally</w:t>
+      </w:r>
+    </w:p>
+    <w:p>
+      <w:r>
+        <w:t>reviewed. The frozen text hash and RFC 3161 timestamp are in</w:t>
+      </w:r>
+    </w:p>
+    <w:p>
+      <w:r>
+        <w:t>`data/adjudication/protocol_freeze_20260925.json`. Investigator verification of</w:t>
+      </w:r>
+    </w:p>
+    <w:p>
+      <w:r>
+        <w:t>delegated G1–G5 gates remains pending; pilot and accessibility-layer papers are</w:t>
+      </w:r>
+    </w:p>
+    <w:p>
+      <w:r>
+        <w:t>excluded from the primary denominator. No main-study slot had opened at the</w:t>
+      </w:r>
+    </w:p>
+    <w:p>
+      <w:r>
+        <w:t>freeze. Later changes require a numbered amendment.</w:t>
       </w:r>
     </w:p>
     <w:p>
@@ -4749,7 +5261,17 @@
     </w:p>
     <w:p>
       <w:r>
-        <w:t>DRAFT — NOT FROZEN. No main-study outcomes have been inspected.</w:t>
+        <w:t>FROZEN 2026-09-25 by AMEND-2026-09-25-05 before main-cohort selection. No</w:t>
+      </w:r>
+    </w:p>
+    <w:p>
+      <w:r>
+        <w:t>main-study outcome existed at the freeze; no pilot value had been adjudicated.</w:t>
+      </w:r>
+    </w:p>
+    <w:p>
+      <w:r>
+        <w:t>Hash and RFC 3161 timestamp: `data/adjudication/protocol_freeze_20260925.json`.</w:t>
       </w:r>
     </w:p>
     <w:p>
@@ -4915,7 +5437,42 @@
     </w:p>
     <w:p>
       <w:r>
-        <w:t>pi_h=n_h/N_h and weight N_h/n_h. No pilot or main selection has occurred.</w:t>
+        <w:t>pi_h=n_h/N_h and weight N_h/n_h. The pilot cases removed are the seven</w:t>
+      </w:r>
+    </w:p>
+    <w:p>
+      <w:r>
+        <w:t>`PROSPECTIVE_PILOT` papers of `PILOT-FREEZE-2026-09-25`; the seven</w:t>
+      </w:r>
+    </w:p>
+    <w:p>
+      <w:r>
+        <w:t>`ACCESSIBILITY_GATE_FAILED` papers and every paper with a machine-readable</w:t>
+      </w:r>
+    </w:p>
+    <w:p>
+      <w:r>
+        <w:t>exclusion class or with text inspected during any earlier candidate review are</w:t>
+      </w:r>
+    </w:p>
+    <w:p>
+      <w:r>
+        <w:t>not eligible. Eligibility is the exhaustive Stage A/Stage B route record under</w:t>
+      </w:r>
+    </w:p>
+    <w:p>
+      <w:r>
+        <w:t>AMEND-2026-09-24-03. Main selection is executed exactly once, after this freeze,</w:t>
+      </w:r>
+    </w:p>
+    <w:p>
+      <w:r>
+        <w:t>by `src/paper2/main_selection.py`, and its record is timestamped before any</w:t>
+      </w:r>
+    </w:p>
+    <w:p>
+      <w:r>
+        <w:t>selected paper's target freeze.</w:t>
       </w:r>
     </w:p>
     <w:p>
@@ -5410,7 +5967,17 @@
     </w:p>
     <w:p>
       <w:r>
-        <w:t>DRAFT — NOT FROZEN; generic scalar comparison is implemented, other scorers pending.</w:t>
+        <w:t>FROZEN 2026-09-25 by AMEND-2026-09-25-05. Generic scalar/count comparison is</w:t>
+      </w:r>
+    </w:p>
+    <w:p>
+      <w:r>
+        <w:t>implemented; a non-scalar target may only be frozen for a main-study paper if</w:t>
+      </w:r>
+    </w:p>
+    <w:p>
+      <w:r>
+        <w:t>its comparison rule below is complete at that paper's prospective freeze.</w:t>
       </w:r>
     </w:p>
     <w:p>
@@ -5838,6 +6405,26 @@
         <w:t>method without introducing alternative analyses.</w:t>
       </w:r>
     </w:p>
+    <w:p>
+      <w:r>
+        <w:t>Value provenance (AMEND-2026-09-25-05 §4): an observed value counts toward L3</w:t>
+      </w:r>
+    </w:p>
+    <w:p>
+      <w:r>
+        <w:t>and L4 only if the adjudicator locates it, to its reported precision, in a</w:t>
+      </w:r>
+    </w:p>
+    <w:p>
+      <w:r>
+        <w:t>journaled execution output produced by journaled code that reads served inputs.</w:t>
+      </w:r>
+    </w:p>
+    <w:p>
+      <w:r>
+        <w:t>A value present only in the report is `not_established`.</w:t>
+      </w:r>
+    </w:p>
     <w:sectPr>
       <w:footerReference w:type="default" r:id="rId9"/>
       <w:pgSz w:w="12240" w:h="15840"/>

</xml_diff>

<commit_message>
Main study: execution layer (AMEND-2026-09-25-06), first tranche, DEV-2026-09-26-01
Co-Authored-By: Tatsuki Onishi <bougtoir@gmail.com>
</commit_message>
<xml_diff>
--- a/paper2_reconstruction/manuscript/Supplement_protocols_DRAFT_EN.docx
+++ b/paper2_reconstruction/manuscript/Supplement_protocols_DRAFT_EN.docx
@@ -2493,6 +2493,495 @@
     <w:p>
       <w:r>
         <w:t>denominator.</w:t>
+      </w:r>
+    </w:p>
+    <w:p>
+      <w:r>
+        <w:br w:type="page"/>
+      </w:r>
+    </w:p>
+    <w:p>
+      <w:pPr>
+        <w:pStyle w:val="Heading1"/>
+      </w:pPr>
+      <w:r>
+        <w:t>Protocol amendment AMEND-2026-09-25-06: main-study execution layer</w:t>
+      </w:r>
+    </w:p>
+    <w:p>
+      <w:r>
+        <w:t>Status: written after the final protocol freeze `PROTOCOL-FREEZE-2026-09-25`</w:t>
+      </w:r>
+    </w:p>
+    <w:p>
+      <w:r>
+        <w:t>(SHA-256 `f3bdc79848672d06785081e339c8e6c26da26cae73b878d49687b933c2f4ef0f`)</w:t>
+      </w:r>
+    </w:p>
+    <w:p>
+      <w:r>
+        <w:t>and after the main cohort `MAIN-COHORT-2026-09-25` (SHA-256</w:t>
+      </w:r>
+    </w:p>
+    <w:p>
+      <w:r>
+        <w:t>`c93708937c2ccf7f67d2e9c79b30db549caf6112ef7e5f82dd93e2becb286b4f`) was</w:t>
+      </w:r>
+    </w:p>
+    <w:p>
+      <w:r>
+        <w:t>selected and timestamped, before any main-study paper was specified, before</w:t>
+      </w:r>
+    </w:p>
+    <w:p>
+      <w:r>
+        <w:t>any main-study input was retrieved and before any main-study solver call. It</w:t>
+      </w:r>
+    </w:p>
+    <w:p>
+      <w:r>
+        <w:t>records how the frozen protocol is executed for the cohort and one clerical</w:t>
+      </w:r>
+    </w:p>
+    <w:p>
+      <w:r>
+        <w:t>correction. No target, tolerance, conclusion or failure rule changes.</w:t>
+      </w:r>
+    </w:p>
+    <w:p>
+      <w:pPr>
+        <w:pStyle w:val="Heading2"/>
+      </w:pPr>
+      <w:r>
+        <w:t>1. Clerical correction to TARGET_SELECTION_RULES.md</w:t>
+      </w:r>
+    </w:p>
+    <w:p>
+      <w:r>
+        <w:t>The document hashed by the final freeze (SHA-256</w:t>
+      </w:r>
+    </w:p>
+    <w:p>
+      <w:r>
+        <w:t>`fc879735acc5698093d1476db7e4d87ac4174807f5cbea0eb2068e91162a99da`) still</w:t>
+      </w:r>
+    </w:p>
+    <w:p>
+      <w:r>
+        <w:t>carried the header line `**DRAFT — NOT FROZEN**` although AMEND-2026-09-25-05</w:t>
+      </w:r>
+    </w:p>
+    <w:p>
+      <w:r>
+        <w:t>froze it by hash together with every other protocol document. The header is</w:t>
+      </w:r>
+    </w:p>
+    <w:p>
+      <w:r>
+        <w:t>replaced by a frozen-status line that cites this amendment. No rule text</w:t>
+      </w:r>
+    </w:p>
+    <w:p>
+      <w:r>
+        <w:t>changes; the freeze record keeps the original hash, and the corrected hash is</w:t>
+      </w:r>
+    </w:p>
+    <w:p>
+      <w:r>
+        <w:t>recorded in `data/adjudication/main-study-20260925/` at the first main-study</w:t>
+      </w:r>
+    </w:p>
+    <w:p>
+      <w:r>
+        <w:t>freeze.</w:t>
+      </w:r>
+    </w:p>
+    <w:p>
+      <w:pPr>
+        <w:pStyle w:val="Heading2"/>
+      </w:pPr>
+      <w:r>
+        <w:t>2. Delegated G1–G5 assessment and ten-field specification</w:t>
+      </w:r>
+    </w:p>
+    <w:p>
+      <w:r>
+        <w:t>For every cohort paper, in the order of `results/main_cohort_20260925.csv`, a</w:t>
+      </w:r>
+    </w:p>
+    <w:p>
+      <w:r>
+        <w:t>delegated model pass (the same provider/model as the solver, deterministic</w:t>
+      </w:r>
+    </w:p>
+    <w:p>
+      <w:r>
+        <w:t>settings, one request, journaled under `data/raw/main-study-20260925/</w:t>
+      </w:r>
+    </w:p>
+    <w:p>
+      <w:r>
+        <w:t>specifier-api/`) receives the segmented article text and the anonymous deposit</w:t>
+      </w:r>
+    </w:p>
+    <w:p>
+      <w:r>
+        <w:t>file listing retained at Stage B. It returns G1–G5 with verbatim quotes, the</w:t>
+      </w:r>
+    </w:p>
+    <w:p>
+      <w:r>
+        <w:t>exact target and its printed values, a blind description of the target, the</w:t>
+      </w:r>
+    </w:p>
+    <w:p>
+      <w:r>
+        <w:t>target type, location, required deposit files, leakage-suspect files, external</w:t>
+      </w:r>
+    </w:p>
+    <w:p>
+      <w:r>
+        <w:t>reference requirements, comparison metric, agreement criterion, specification</w:t>
+      </w:r>
+    </w:p>
+    <w:p>
+      <w:r>
+        <w:t>gaps and rejected alternatives.</w:t>
+      </w:r>
+    </w:p>
+    <w:p>
+      <w:r>
+        <w:t>The harness verifies programmatically that every quote occurs verbatim in the</w:t>
+      </w:r>
+    </w:p>
+    <w:p>
+      <w:r>
+        <w:t>cited segment or its immediate neighbours (segmentation is a harness artifact</w:t>
+      </w:r>
+    </w:p>
+    <w:p>
+      <w:r>
+        <w:t>that can split sentences), that every printed target value occurs in the cited</w:t>
+      </w:r>
+    </w:p>
+    <w:p>
+      <w:r>
+        <w:t>location</w:t>
+      </w:r>
+    </w:p>
+    <w:p>
+      <w:r>
+        <w:t>quotes, that the blind description contains no printed value, that the target</w:t>
+      </w:r>
+    </w:p>
+    <w:p>
+      <w:r>
+        <w:t>type has a complete comparison rule in TOLERANCE_RULES.md and that required</w:t>
+      </w:r>
+    </w:p>
+    <w:p>
+      <w:r>
+        <w:t>files exist in the listing. A paper is `specifiable` only if no gate is `no`,</w:t>
+      </w:r>
+    </w:p>
+    <w:p>
+      <w:r>
+        <w:t>the target value is located verbatim, at least one listed input is required and</w:t>
+      </w:r>
+    </w:p>
+    <w:p>
+      <w:r>
+        <w:t>no external reference resource beyond the served material is required.</w:t>
+      </w:r>
+    </w:p>
+    <w:p>
+      <w:r>
+        <w:t>Otherwise the paper is recorded with its machine-readable state</w:t>
+      </w:r>
+    </w:p>
+    <w:p>
+      <w:r>
+        <w:t>(`gate_failed_delegated`, `target_value_not_located_verbatim`,</w:t>
+      </w:r>
+    </w:p>
+    <w:p>
+      <w:r>
+        <w:t>`required_inputs_not_in_public_listing`,</w:t>
+      </w:r>
+    </w:p>
+    <w:p>
+      <w:r>
+        <w:t>`external_reference_resource_required_not_served`,</w:t>
+      </w:r>
+    </w:p>
+    <w:p>
+      <w:r>
+        <w:t>`specification_not_obtained`) and is **not** run. It stays in the cohort and</w:t>
+      </w:r>
+    </w:p>
+    <w:p>
+      <w:r>
+        <w:t>in the denominator defined by the SAP for post-selection ineligibility; it is</w:t>
+      </w:r>
+    </w:p>
+    <w:p>
+      <w:r>
+        <w:t>never replaced. Every delegated assessment is `investigator_verification:</w:t>
+      </w:r>
+    </w:p>
+    <w:p>
+      <w:r>
+        <w:t>pending` and `human_adjudication: pending`.</w:t>
+      </w:r>
+    </w:p>
+    <w:p>
+      <w:pPr>
+        <w:pStyle w:val="Heading2"/>
+      </w:pPr>
+      <w:r>
+        <w:t>3. Input acquisition and leakage exclusion</w:t>
+      </w:r>
+    </w:p>
+    <w:p>
+      <w:r>
+        <w:t>Only the files the specification names are retrieved, anonymously, from the</w:t>
+      </w:r>
+    </w:p>
+    <w:p>
+      <w:r>
+        <w:t>public deposit route retained at Stage B, streamed to</w:t>
+      </w:r>
+    </w:p>
+    <w:p>
+      <w:r>
+        <w:t>`/home/ubuntu/paper2_evidence/main-inputs-20260925/&lt;PMID&gt;/` with an immutable</w:t>
+      </w:r>
+    </w:p>
+    <w:p>
+      <w:r>
+        <w:t>receipt (URL, identifier, UTC time, request conditions, bytes, SHA-256,</w:t>
+      </w:r>
+    </w:p>
+    <w:p>
+      <w:r>
+        <w:t>announced checksum, completeness). Frozen caps: 2 GiB per file, 8 GiB per</w:t>
+      </w:r>
+    </w:p>
+    <w:p>
+      <w:r>
+        <w:t>paper, retrieval stops when local free storage would fall below 12 GiB</w:t>
+      </w:r>
+    </w:p>
+    <w:p>
+      <w:r>
+        <w:t>(recorded as `local_storage_exhausted`, not as an access verdict). A file named</w:t>
+      </w:r>
+    </w:p>
+    <w:p>
+      <w:r>
+        <w:t>by the specifier as answer-bearing, or in which any printed target value occurs</w:t>
+      </w:r>
+    </w:p>
+    <w:p>
+      <w:r>
+        <w:t>as a whole numeric token, is excluded as</w:t>
+      </w:r>
+    </w:p>
+    <w:p>
+      <w:r>
+        <w:t>`target_or_data_leakage_*` and never served. Result-like header columns are</w:t>
+      </w:r>
+    </w:p>
+    <w:p>
+      <w:r>
+        <w:t>recorded for adjudication but do not by themselves exclude a file. A paper</w:t>
+      </w:r>
+    </w:p>
+    <w:p>
+      <w:r>
+        <w:t>whose every required input is leakage-excluded is recorded</w:t>
+      </w:r>
+    </w:p>
+    <w:p>
+      <w:r>
+        <w:t>`all_inputs_leak_target` and not run.</w:t>
+      </w:r>
+    </w:p>
+    <w:p>
+      <w:pPr>
+        <w:pStyle w:val="Heading2"/>
+      </w:pPr>
+      <w:r>
+        <w:t>4. Per-paper prospective freeze</w:t>
+      </w:r>
+    </w:p>
+    <w:p>
+      <w:r>
+        <w:t>Before a paper's first slot its ten-field record (exact target, location with</w:t>
+      </w:r>
+    </w:p>
+    <w:p>
+      <w:r>
+        <w:t>quotes, required inputs with SHA-256 and bytes, allowed resources, blocked</w:t>
+      </w:r>
+    </w:p>
+    <w:p>
+      <w:r>
+        <w:t>original artifacts, comparison metric, agreement criterion, conclusion</w:t>
+      </w:r>
+    </w:p>
+    <w:p>
+      <w:r>
+        <w:t>criterion, final resource ceiling, stopping rule) is written to</w:t>
+      </w:r>
+    </w:p>
+    <w:p>
+      <w:r>
+        <w:t>`data/adjudication/main-study-20260925/freezes/&lt;PMID&gt;.json` and RFC 3161</w:t>
+      </w:r>
+    </w:p>
+    <w:p>
+      <w:r>
+        <w:t>timestamped. The solver instruction carries only the blind description.</w:t>
+      </w:r>
+    </w:p>
+    <w:p>
+      <w:pPr>
+        <w:pStyle w:val="Heading2"/>
+      </w:pPr>
+      <w:r>
+        <w:t>5. Slots, order and quota stop</w:t>
+      </w:r>
+    </w:p>
+    <w:p>
+      <w:r>
+        <w:t>Exactly three sequential independent slots per specifiable paper, each in a</w:t>
+      </w:r>
+    </w:p>
+    <w:p>
+      <w:r>
+        <w:t>fresh isolated worker under the final ceiling of AMEND-2026-09-25-05</w:t>
+      </w:r>
+    </w:p>
+    <w:p>
+      <w:r>
+        <w:t>(1,500,000 provider tokens; other limits unchanged), on one machine. Papers are</w:t>
+      </w:r>
+    </w:p>
+    <w:p>
+      <w:r>
+        <w:t>processed strictly in cohort order. Execution ends when the investigator's</w:t>
+      </w:r>
+    </w:p>
+    <w:p>
+      <w:r>
+        <w:t>provider quota is exhausted (three consecutive slots ending in a controller</w:t>
+      </w:r>
+    </w:p>
+    <w:p>
+      <w:r>
+        <w:t>error before any tool call, or a provider stop during specification) or when</w:t>
+      </w:r>
+    </w:p>
+    <w:p>
+      <w:r>
+        <w:t>the cohort is complete. Papers not reached, or reached without all three slots</w:t>
+      </w:r>
+    </w:p>
+    <w:p>
+      <w:r>
+        <w:t>completed, are sealed as `not_run_resource_exhausted`; they remain in the</w:t>
+      </w:r>
+    </w:p>
+    <w:p>
+      <w:r>
+        <w:t>cohort as unresolved and are never replaced or counted as failures. Completed</w:t>
+      </w:r>
+    </w:p>
+    <w:p>
+      <w:r>
+        <w:t>slots are sealed before adjudication or any reveal.</w:t>
+      </w:r>
+    </w:p>
+    <w:p>
+      <w:pPr>
+        <w:pStyle w:val="Heading2"/>
+      </w:pPr>
+      <w:r>
+        <w:t>6. What this amendment does not do</w:t>
+      </w:r>
+    </w:p>
+    <w:p>
+      <w:r>
+        <w:t>It does not change any frozen rule, does not re-run or re-score the pilot, does</w:t>
+      </w:r>
+    </w:p>
+    <w:p>
+      <w:r>
+        <w:t>not compute any success or failure rate, does not contact original authors and</w:t>
+      </w:r>
+    </w:p>
+    <w:p>
+      <w:r>
+        <w:t>does not perform any Paper III analysis.</w:t>
+      </w:r>
+    </w:p>
+    <w:p>
+      <w:pPr>
+        <w:pStyle w:val="Heading2"/>
+      </w:pPr>
+      <w:r>
+        <w:t>7. Deposited code is withheld (DEV-2026-09-26-01)</w:t>
+      </w:r>
+    </w:p>
+    <w:p>
+      <w:r>
+        <w:t>On the first specifiable cohort paper the delegated specifier named deposited R</w:t>
+      </w:r>
+    </w:p>
+    <w:p>
+      <w:r>
+        <w:t>scripts in `required_files` and the harness served them. Deposited scripts,</w:t>
+      </w:r>
+    </w:p>
+    <w:p>
+      <w:r>
+        <w:t>notebooks and workflow files are original implementation artifacts under</w:t>
+      </w:r>
+    </w:p>
+    <w:p>
+      <w:r>
+        <w:t>INFORMATION_FIREWALL.md and are never served; they are excluded as</w:t>
+      </w:r>
+    </w:p>
+    <w:p>
+      <w:r>
+        <w:t>`original_implementation_artifact_withheld` by file name, the specifier is told</w:t>
+      </w:r>
+    </w:p>
+    <w:p>
+      <w:r>
+        <w:t>not to list them, and a paper whose every required input is code is recorded</w:t>
+      </w:r>
+    </w:p>
+    <w:p>
+      <w:r>
+        <w:t>`all_inputs_original_implementation` and not run. The two started slots are</w:t>
+      </w:r>
+    </w:p>
+    <w:p>
+      <w:r>
+        <w:t>void (retained under `voided/`, in no denominator); the paper is re-frozen and</w:t>
+      </w:r>
+    </w:p>
+    <w:p>
+      <w:r>
+        <w:t>run with three fresh slots. Details: `data/adjudication/main-study-20260925/</w:t>
+      </w:r>
+    </w:p>
+    <w:p>
+      <w:r>
+        <w:t>deviations/DEV-2026-09-26-01.json`.</w:t>
       </w:r>
     </w:p>
     <w:p>
@@ -5859,7 +6348,17 @@
     </w:p>
     <w:p>
       <w:r>
-        <w:t>DRAFT — NOT FROZEN</w:t>
+        <w:t>FROZEN 2026-09-25 by AMEND-2026-09-25-05 (hash</w:t>
+      </w:r>
+    </w:p>
+    <w:p>
+      <w:r>
+        <w:t>`fc879735acc5698093d1476db7e4d87ac4174807f5cbea0eb2068e91162a99da`); stale</w:t>
+      </w:r>
+    </w:p>
+    <w:p>
+      <w:r>
+        <w:t>draft header corrected by AMEND-2026-09-25-06 without any rule change.</w:t>
       </w:r>
     </w:p>
     <w:p>

</xml_diff>

<commit_message>
Main study: cohort execution complete, blind outcomes sealed (unadjudicated)
Co-Authored-By: Tatsuki Onishi <bougtoir@gmail.com>
</commit_message>
<xml_diff>
--- a/paper2_reconstruction/manuscript/Supplement_protocols_DRAFT_EN.docx
+++ b/paper2_reconstruction/manuscript/Supplement_protocols_DRAFT_EN.docx
@@ -2982,6 +2982,59 @@
     <w:p>
       <w:r>
         <w:t>deviations/DEV-2026-09-26-01.json`.</w:t>
+      </w:r>
+    </w:p>
+    <w:p>
+      <w:pPr>
+        <w:pStyle w:val="Heading2"/>
+      </w:pPr>
+      <w:r>
+        <w:t>8. OSF listings are resolved from the retained provider listings (DEV-2026-09-27-01)</w:t>
+      </w:r>
+    </w:p>
+    <w:p>
+      <w:r>
+        <w:t>On the 41st cohort paper the harness read an OSF route from its GUID record,</w:t>
+      </w:r>
+    </w:p>
+    <w:p>
+      <w:r>
+        <w:t>which is a node object rather than a file list, and stopped with an exception</w:t>
+      </w:r>
+    </w:p>
+    <w:p>
+      <w:r>
+        <w:t>before the specifier was called. The screening layer had already retained the</w:t>
+      </w:r>
+    </w:p>
+    <w:p>
+      <w:r>
+        <w:t>per-provider file listings for every OSF route; the resolver now reads those</w:t>
+      </w:r>
+    </w:p>
+    <w:p>
+      <w:r>
+        <w:t>sha256-verified bodies, skips folders, shows files as `&lt;provider&gt;:&lt;name&gt;` and</w:t>
+      </w:r>
+    </w:p>
+    <w:p>
+      <w:r>
+        <w:t>serves them under the bare file name. No new listing request is made, no slot,</w:t>
+      </w:r>
+    </w:p>
+    <w:p>
+      <w:r>
+        <w:t>instruction, ceiling or rule changes, and the manifest is superseded and</w:t>
+      </w:r>
+    </w:p>
+    <w:p>
+      <w:r>
+        <w:t>retained. Details: `data/adjudication/main-study-20260925/deviations/</w:t>
+      </w:r>
+    </w:p>
+    <w:p>
+      <w:r>
+        <w:t>DEV-2026-09-27-01.json`.</w:t>
       </w:r>
     </w:p>
     <w:p>

</xml_diff>